<commit_message>
Most of formatting issues resolved
</commit_message>
<xml_diff>
--- a/Communications/SoutheastCon_Communication_01_Direct_Serial.docx
+++ b/Communications/SoutheastCon_Communication_01_Direct_Serial.docx
@@ -319,7 +319,7 @@
         <w:spacing w:line="240" w:lineRule="auto"/>
       </w:pPr>
       <w:r>
-        <w:t>The Arduino Mega 2560 and ESP32 can communicate using ordinary UART serial communication, but they do not operate at the same logic voltage. This is an important electrical difference that must be understood before connecting the two processors.</w:t>
+        <w:t>The Arduino Mega 2560 and ESP32 can communicate using ordinary UART serial communication, but they do not operate at the same logic voltage. This is an important electrical difference that must be understood before connecting the two processors. The same 5v and 3.3v logic-level principles also apply to other digital signal connections.</w:t>
       </w:r>
     </w:p>
     <w:p>
@@ -327,7 +327,7 @@
         <w:spacing w:line="240" w:lineRule="auto"/>
       </w:pPr>
       <w:r>
-        <w:t>For this experiment, the Arduino Mega 2560 operates at 5v and the ESP32 operates at approximately 3.3v. Both devices use digital signals to represent binary data. A digital LOW is represented by a voltage near 0v, while a digital HIGH is represented by a voltage appropriate to that processor's logic supply.</w:t>
+        <w:t>For this experiment, the Arduino Mega 2560 operates at 5v and the ESP32 operates at approximately 3.3v. Both devices use digital signals to represent binary data. A digital LOW is represented by a voltage near 0v, while a digital HIGH is represented by a higher voltage. The important point is that the acceptable voltage for a HIGH depends on the receiving device.</w:t>
       </w:r>
     </w:p>
     <w:p>
@@ -335,7 +335,7 @@
         <w:spacing w:line="240" w:lineRule="auto"/>
       </w:pPr>
       <w:r>
-        <w:t>The important point is that 5v and 3.3v are not interchangeable logic levels. The ESP32 GPIO pins are designed for approximately 3.3v operation. A voltage above the ESP32's specified input limit can damage its GPIO.</w:t>
+        <w:t>The important point is that 5v and 3.3v are not interchangeable logic levels. A 3.3v output can be acceptable to some 5v inputs, while a 5v output may not be safe for a 3.3v input. Always determine the electrical requirements of both sides before connecting a signal between systems that use different logic voltages. In this tutorial, the ESP32 GPIO pins are designed for approximately 3.3v operation, so a voltage above the ESP32's specified input limit can damage its GPIO.</w:t>
       </w:r>
     </w:p>
     <w:p>
@@ -352,15 +352,55 @@
         <w:spacing w:line="240" w:lineRule="auto"/>
       </w:pPr>
       <w:r>
-        <w:t>The two directions of communication are not electrically identical. That is why this tutorial uses a direct connection in one direction and a resistor divider in the other.</w:t>
+        <w:t>The two directions of communication are not electrically identical because the voltage levels produced by the two processors are different. That is why this tutorial uses a direct connection in one direction and a resistor divider in the other. The same level-shifting concept can be used for other digital signals, not just UART.</w:t>
       </w:r>
     </w:p>
     <w:p>
       <w:pPr>
+        <w:pStyle w:val="Normal"/>
+      </w:pPr>
+      <w:r>
+        <w:t>The signal connections for this tutorial are:</w:t>
+      </w:r>
+    </w:p>
+    <w:p>
+      <w:pPr>
+        <w:pStyle w:val="Normal"/>
+      </w:pPr>
+      <w:r>
+        <w:t>ESP32 TX2 → Mega RX1</w:t>
+      </w:r>
+    </w:p>
+    <w:p>
+      <w:pPr>
+        <w:pStyle w:val="Normal"/>
+      </w:pPr>
+      <w:r>
+        <w:t>Mega TX1 → ESP32 RX2 through the resistor divider</w:t>
+      </w:r>
+    </w:p>
+    <w:p>
+      <w:pPr>
+        <w:pStyle w:val="Normal"/>
+      </w:pPr>
+      <w:r>
+        <w:t>Do not connect TX to TX or RX to RX.</w:t>
+      </w:r>
+    </w:p>
+    <w:p>
+      <w:pPr>
+        <w:pStyle w:val="Normal"/>
+      </w:pPr>
+      <w:r>
+        <w:t>TX means transmit data, and RX means receive data. In a UART connection, the transmitter's TX signal connects to the receiver's RX input.</w:t>
+      </w:r>
+    </w:p>
+    <w:p>
+      <w:pPr>
         <w:spacing w:line="240" w:lineRule="auto"/>
       </w:pPr>
       <w:r>
-        <w:t>Because the two HIGH levels are compatible but relatively close to the Mega 2560's minimum guaranteed HIGH threshold, this direct connection is intended for short distances and modest baud rates. It is not recommended for long cable runs or high-speed communication. At 1200 baud, however, it should work very well over the short distance between two breakout boards on the same laboratory bench.</w:t>
+        <w:t>Because the ESP32's approximately 3.3v HIGH is above the Mega 2560's minimum guaranteed HIGH input threshold, the ESP32 TX signal can connect directly to the Mega RX input.</w:t>
       </w:r>
     </w:p>
     <w:p>
@@ -377,16 +417,12 @@
     </w:p>
     <w:p>
       <w:r>
-        <w:t xml:space="preserve">ESP32 </w:t>
+        <w:t>ESP32 TX2  ───────────────────────────────&gt; Mega 2560 RX1</w:t>
       </w:r>
       <w:proofErr w:type="gramStart"/>
-      <w:r>
-        <w:t>TX  ─</w:t>
-      </w:r>
+      <w:r/>
       <w:proofErr w:type="gramEnd"/>
-      <w:r>
-        <w:t>──────────────────────────────&gt; Mega 2560 RX</w:t>
-      </w:r>
+      <w:r/>
     </w:p>
     <w:p>
       <w:pPr>
@@ -442,16 +478,12 @@
     </w:p>
     <w:p>
       <w:r>
-        <w:t xml:space="preserve">Mega 2560 </w:t>
+        <w:t>Mega 2560 TX1  ────────────────────────────────&gt; ESP32 RX2</w:t>
       </w:r>
       <w:proofErr w:type="gramStart"/>
-      <w:r>
-        <w:t>TX  ─</w:t>
-      </w:r>
+      <w:r/>
       <w:proofErr w:type="gramEnd"/>
-      <w:r>
-        <w:t>───────────────────────────────&gt; ESP32 RX</w:t>
-      </w:r>
+      <w:r/>
     </w:p>
     <w:p>
       <w:pPr>
@@ -499,6 +531,30 @@
       </w:pPr>
       <w:r>
         <w:t>A 2 kΩ between the ESP32 RX node and GND.</w:t>
+      </w:r>
+    </w:p>
+    <w:p>
+      <w:pPr>
+        <w:pStyle w:val="Normal"/>
+      </w:pPr>
+      <w:r>
+        <w:t>For these resistor values, a 5v input is reduced to approximately 3.33v:</w:t>
+      </w:r>
+    </w:p>
+    <w:p>
+      <w:pPr>
+        <w:pStyle w:val="Normal"/>
+      </w:pPr>
+      <w:r>
+        <w:t>5v × 2 kΩ / (1 kΩ + 2 kΩ) ≈ 3.33v</w:t>
+      </w:r>
+    </w:p>
+    <w:p>
+      <w:pPr>
+        <w:pStyle w:val="Normal"/>
+      </w:pPr>
+      <w:r>
+        <w:t>Important: The resistor divider is required only in the Mega TX1 → ESP32 RX2 direction. Do not place the divider in the ESP32 TX2 → Mega RX1 path.</w:t>
       </w:r>
     </w:p>
     <w:p>
@@ -553,7 +609,7 @@
         </w:rPr>
         <w:drawing>
           <wp:inline distT="0" distB="0" distL="0" distR="0" wp14:anchorId="153172A8" wp14:editId="2508658F">
-            <wp:extent cx="6400800" cy="4262755"/>
+            <wp:extent cx="6400800" cy="3200400"/>
             <wp:effectExtent l="0" t="0" r="0" b="0"/>
             <wp:docPr id="1" name="Picture 2"/>
             <wp:cNvGraphicFramePr>
@@ -577,7 +633,7 @@
                   <pic:spPr bwMode="auto">
                     <a:xfrm>
                       <a:off x="0" y="0"/>
-                      <a:ext cx="6400800" cy="4262755"/>
+                      <a:ext cx="6400800" cy="3200400"/>
                     </a:xfrm>
                     <a:prstGeom prst="rect">
                       <a:avLst/>
@@ -661,6 +717,14 @@
     </w:p>
     <w:p>
       <w:pPr>
+        <w:pStyle w:val="Normal"/>
+      </w:pPr>
+      <w:r>
+        <w:t>The USB connection to the computer is used to power, program, and monitor each development board. It is separate from the UART connection being tested between the Mega and ESP32.</w:t>
+      </w:r>
+    </w:p>
+    <w:p>
+      <w:pPr>
         <w:spacing w:line="240" w:lineRule="auto"/>
       </w:pPr>
       <w:r>
@@ -826,85 +890,59 @@
       </w:pPr>
       <w:r>
         <w:t>// ESP32 receiver</w:t>
-      </w:r>
-      <w:r>
         <w:br/>
-      </w:r>
-      <w:r>
         <w:br/>
-        <w:t xml:space="preserve">void </w:t>
-      </w:r>
-      <w:proofErr w:type="gramStart"/>
-      <w:r>
-        <w:t>setup(</w:t>
-      </w:r>
-      <w:proofErr w:type="gramEnd"/>
-      <w:r>
-        <w:t>)</w:t>
-      </w:r>
-      <w:r>
+        <w:t>void setup()</w:t>
         <w:br/>
         <w:t>{</w:t>
-      </w:r>
-      <w:r>
         <w:br/>
-        <w:t xml:space="preserve">    </w:t>
-      </w:r>
-      <w:proofErr w:type="spellStart"/>
-      <w:r>
-        <w:t>Serial.begin</w:t>
-      </w:r>
-      <w:proofErr w:type="spellEnd"/>
-      <w:r>
-        <w:t>(115200);</w:t>
-      </w:r>
-      <w:r>
+        <w:t xml:space="preserve">    Serial.begin(115200);</w:t>
         <w:br/>
-        <w:t xml:space="preserve">    Serial2.begin(9600);</w:t>
-      </w:r>
-      <w:r>
+        <w:t xml:space="preserve">    Serial2.begin(9600, SERIAL_8N1, 16, 17);</w:t>
         <w:br/>
         <w:t>}</w:t>
-      </w:r>
-      <w:r>
         <w:br/>
-      </w:r>
-      <w:r>
         <w:br/>
         <w:t>void loop()</w:t>
-      </w:r>
-      <w:r>
         <w:br/>
         <w:t>{</w:t>
-      </w:r>
-      <w:r>
         <w:br/>
         <w:t xml:space="preserve">    while (Serial2.available())</w:t>
-      </w:r>
-      <w:r>
         <w:br/>
         <w:t xml:space="preserve">    {</w:t>
-      </w:r>
-      <w:r>
         <w:br/>
-        <w:t xml:space="preserve">        </w:t>
-      </w:r>
-      <w:proofErr w:type="spellStart"/>
-      <w:r>
-        <w:t>Serial.write</w:t>
-      </w:r>
-      <w:proofErr w:type="spellEnd"/>
-      <w:r>
-        <w:t>(Serial2.read());</w:t>
-      </w:r>
-      <w:r>
+        <w:t xml:space="preserve">        Serial.write(Serial2.read());</w:t>
         <w:br/>
         <w:t xml:space="preserve">    }</w:t>
-      </w:r>
-      <w:r>
         <w:br/>
         <w:t>}</w:t>
       </w:r>
+      <w:r/>
+      <w:r/>
+      <w:proofErr w:type="gramStart"/>
+      <w:r/>
+      <w:proofErr w:type="gramEnd"/>
+      <w:r/>
+      <w:r/>
+      <w:r/>
+      <w:proofErr w:type="spellStart"/>
+      <w:r/>
+      <w:proofErr w:type="spellEnd"/>
+      <w:r/>
+      <w:r/>
+      <w:r/>
+      <w:r/>
+      <w:r/>
+      <w:r/>
+      <w:r/>
+      <w:r/>
+      <w:r/>
+      <w:proofErr w:type="spellStart"/>
+      <w:r/>
+      <w:proofErr w:type="spellEnd"/>
+      <w:r/>
+      <w:r/>
+      <w:r/>
     </w:p>
     <w:p>
       <w:pPr>
@@ -919,7 +957,7 @@
         <w:spacing w:line="240" w:lineRule="auto"/>
       </w:pPr>
       <w:r>
-        <w:t>Important: The exact GPIO pins used for Serial2 depend on the ESP32 development board being used. Use the UART pins appropriate for your board and connect the selected ESP32 TX/RX pins to the corresponding connections described in Part 1.</w:t>
+        <w:t>For the ESP32 configuration shown in this tutorial, Serial2 uses GPIO16 for RX2 and GPIO17 for TX2. The wiring diagram and code use these same pins.</w:t>
       </w:r>
     </w:p>
     <w:p>
@@ -1025,7 +1063,7 @@
         <w:spacing w:line="240" w:lineRule="auto"/>
       </w:pPr>
       <w:r>
-        <w:t xml:space="preserve">Modify the programs so that the ESP32 transmits and the Mega 2560 receives. </w:t>
+        <w:t>Modify the programs so that the ESP32 transmits through Serial2 and the Mega 2560 receives through Serial1.</w:t>
       </w:r>
     </w:p>
     <w:p>
@@ -1033,8 +1071,7 @@
         <w:spacing w:line="240" w:lineRule="auto"/>
       </w:pPr>
       <w:r>
-        <w:lastRenderedPageBreak/>
-        <w:t>The signal path is now ESP32 TX → Mega 2560 RX.</w:t>
+        <w:t>The signal path is now ESP32 TX2 → Mega 2560 RX1.</w:t>
       </w:r>
     </w:p>
     <w:p>
@@ -1050,7 +1087,7 @@
         <w:spacing w:line="240" w:lineRule="auto"/>
       </w:pPr>
       <w:r>
-        <w:t>Create a short message such as "Hello from ESP32" and verify that the Mega 2560 receives it correctly.</w:t>
+        <w:t>Have the ESP32 send a short message such as "Hello from ESP32" through Serial2. Have the Mega receive it through Serial1 and display the received message through its USB serial connection.</w:t>
       </w:r>
     </w:p>
     <w:p>
@@ -1236,143 +1273,6 @@
     </w:p>
     <w:p>
       <w:pPr>
-        <w:pStyle w:val="Heading3"/>
-        <w:spacing w:line="240" w:lineRule="auto"/>
-      </w:pPr>
-      <w:r>
-        <w:rPr>
-          <w:rFonts w:ascii="Calibri" w:eastAsia="Calibri" w:hAnsi="Calibri" w:cs="Calibri"/>
-        </w:rPr>
-        <w:t>Experiment 4 — Add a Sequence Number</w:t>
-      </w:r>
-    </w:p>
-    <w:p>
-      <w:pPr>
-        <w:spacing w:line="240" w:lineRule="auto"/>
-      </w:pPr>
-      <w:r>
-        <w:t>Modify the transmitter so that each message contains a sequence number.</w:t>
-      </w:r>
-    </w:p>
-    <w:p>
-      <w:pPr>
-        <w:pBdr>
-          <w:top w:val="single" w:sz="8" w:space="4" w:color="000000"/>
-          <w:left w:val="single" w:sz="8" w:space="4" w:color="000000"/>
-          <w:right w:val="single" w:sz="8" w:space="4" w:color="000000"/>
-        </w:pBdr>
-        <w:spacing w:line="240" w:lineRule="auto"/>
-      </w:pPr>
-      <w:r>
-        <w:t>Message 1</w:t>
-      </w:r>
-    </w:p>
-    <w:p>
-      <w:pPr>
-        <w:pBdr>
-          <w:left w:val="single" w:sz="8" w:space="4" w:color="000000"/>
-          <w:right w:val="single" w:sz="8" w:space="4" w:color="000000"/>
-        </w:pBdr>
-        <w:spacing w:line="240" w:lineRule="auto"/>
-      </w:pPr>
-      <w:r>
-        <w:t>Message 2</w:t>
-      </w:r>
-    </w:p>
-    <w:p>
-      <w:pPr>
-        <w:pBdr>
-          <w:left w:val="single" w:sz="8" w:space="4" w:color="000000"/>
-          <w:right w:val="single" w:sz="8" w:space="4" w:color="000000"/>
-        </w:pBdr>
-        <w:spacing w:line="240" w:lineRule="auto"/>
-      </w:pPr>
-      <w:r>
-        <w:t>Message 3</w:t>
-      </w:r>
-    </w:p>
-    <w:p>
-      <w:pPr>
-        <w:pBdr>
-          <w:left w:val="single" w:sz="8" w:space="4" w:color="000000"/>
-          <w:bottom w:val="single" w:sz="8" w:space="4" w:color="000000"/>
-          <w:right w:val="single" w:sz="8" w:space="4" w:color="000000"/>
-        </w:pBdr>
-        <w:spacing w:line="240" w:lineRule="auto"/>
-      </w:pPr>
-      <w:r>
-        <w:t>Message 4</w:t>
-      </w:r>
-    </w:p>
-    <w:p>
-      <w:pPr>
-        <w:spacing w:line="240" w:lineRule="auto"/>
-      </w:pPr>
-      <w:r>
-        <w:t>Continue increasing the number. The receiver should display the messages. Now consider how the receiver could detect a missing message.</w:t>
-      </w:r>
-    </w:p>
-    <w:p>
-      <w:pPr>
-        <w:pBdr>
-          <w:top w:val="single" w:sz="8" w:space="4" w:color="000000"/>
-          <w:left w:val="single" w:sz="8" w:space="4" w:color="000000"/>
-          <w:right w:val="single" w:sz="8" w:space="4" w:color="000000"/>
-        </w:pBdr>
-        <w:spacing w:line="240" w:lineRule="auto"/>
-      </w:pPr>
-      <w:r>
-        <w:t>Message 21</w:t>
-      </w:r>
-    </w:p>
-    <w:p>
-      <w:pPr>
-        <w:pBdr>
-          <w:left w:val="single" w:sz="8" w:space="4" w:color="000000"/>
-          <w:right w:val="single" w:sz="8" w:space="4" w:color="000000"/>
-        </w:pBdr>
-        <w:spacing w:line="240" w:lineRule="auto"/>
-      </w:pPr>
-      <w:r>
-        <w:t>Message 22</w:t>
-      </w:r>
-    </w:p>
-    <w:p>
-      <w:pPr>
-        <w:pBdr>
-          <w:left w:val="single" w:sz="8" w:space="4" w:color="000000"/>
-          <w:right w:val="single" w:sz="8" w:space="4" w:color="000000"/>
-        </w:pBdr>
-        <w:spacing w:line="240" w:lineRule="auto"/>
-      </w:pPr>
-      <w:r>
-        <w:t>Message 24</w:t>
-      </w:r>
-    </w:p>
-    <w:p>
-      <w:pPr>
-        <w:pBdr>
-          <w:left w:val="single" w:sz="8" w:space="4" w:color="000000"/>
-          <w:bottom w:val="single" w:sz="8" w:space="4" w:color="000000"/>
-          <w:right w:val="single" w:sz="8" w:space="4" w:color="000000"/>
-        </w:pBdr>
-        <w:spacing w:line="240" w:lineRule="auto"/>
-      </w:pPr>
-      <w:r>
-        <w:lastRenderedPageBreak/>
-        <w:t>Message 25</w:t>
-      </w:r>
-    </w:p>
-    <w:p>
-      <w:pPr>
-        <w:spacing w:line="240" w:lineRule="auto"/>
-      </w:pPr>
-      <w:r>
-        <w:t>It can determine that Message 23 was not received. This is the beginning of an important communication-system concept: error detection.</w:t>
-      </w:r>
-    </w:p>
-    <w:p>
-      <w:pPr>
         <w:pStyle w:val="Heading1"/>
         <w:spacing w:line="240" w:lineRule="auto"/>
       </w:pPr>
@@ -1575,19 +1475,6 @@
     </w:p>
     <w:p>
       <w:pPr>
-        <w:pStyle w:val="ListBullet"/>
-        <w:numPr>
-          <w:ilvl w:val="0"/>
-          <w:numId w:val="3"/>
-        </w:numPr>
-        <w:spacing w:after="0" w:line="240" w:lineRule="auto"/>
-      </w:pPr>
-      <w:r>
-        <w:t>A communication system can detect missing messages by using sequence numbers.</w:t>
-      </w:r>
-    </w:p>
-    <w:p>
-      <w:pPr>
         <w:pStyle w:val="Heading1"/>
         <w:spacing w:line="240" w:lineRule="auto"/>
       </w:pPr>
@@ -1727,7 +1614,7 @@
         <w:spacing w:line="240" w:lineRule="auto"/>
       </w:pPr>
       <w:r>
-        <w:t>I can communicate between the Arduino Mega 2560 and ESP32 in at least one direction.</w:t>
+        <w:t>I can communicate between the Arduino Mega 2560 and ESP32 in both directions.</w:t>
       </w:r>
     </w:p>
     <w:p>
@@ -1740,18 +1627,6 @@
       </w:pPr>
       <w:r>
         <w:t>I can explain why both ends of a UART connection must agree on the baud rate.</w:t>
-      </w:r>
-    </w:p>
-    <w:p>
-      <w:pPr>
-        <w:numPr>
-          <w:ilvl w:val="0"/>
-          <w:numId w:val="3"/>
-        </w:numPr>
-        <w:spacing w:line="240" w:lineRule="auto"/>
-      </w:pPr>
-      <w:r>
-        <w:t>I can describe one way to detect a missing message.</w:t>
       </w:r>
     </w:p>
     <w:p>

</xml_diff>

<commit_message>
Add the two communication tutorials
</commit_message>
<xml_diff>
--- a/Communications/SoutheastCon_Communication_01_Direct_Serial.docx
+++ b/Communications/SoutheastCon_Communication_01_Direct_Serial.docx
@@ -52,7 +52,13 @@
         <w:spacing w:line="240" w:lineRule="auto"/>
       </w:pPr>
       <w:r>
-        <w:t>In this tutorial, you will learn how two microcontrollers can exchange serial data even though they use different logic voltages. You will examine the electrical requirements of each direction of communication, build a simple resistor-divider level shifter, and verify communication at several baud rates.</w:t>
+        <w:t xml:space="preserve">In this tutorial, you will learn how two microcontrollers can exchange serial data even though they use different logic voltages. You will examine the electrical requirements of each direction of communication, build a simple resistor-divider level shifter, and verify communication </w:t>
+      </w:r>
+      <w:r>
+        <w:t>in both directions</w:t>
+      </w:r>
+      <w:r>
+        <w:t>.</w:t>
       </w:r>
     </w:p>
     <w:p>
@@ -141,7 +147,10 @@
         <w:spacing w:line="240" w:lineRule="auto"/>
       </w:pPr>
       <w:r>
-        <w:t>Test serial communication at several baud rates.</w:t>
+        <w:t xml:space="preserve">Test serial communication </w:t>
+      </w:r>
+      <w:r>
+        <w:t>in both directions.</w:t>
       </w:r>
     </w:p>
     <w:p>
@@ -293,13 +302,61 @@
           <w:bCs/>
           <w:color w:val="FF0000"/>
         </w:rPr>
-        <w:t>Do not connect the VCC/positive power rail of the Mega 2560's breadboard to the VCC/positive power rail of the ESP32's breadboard.</w:t>
+        <w:t>Do not connect the VCC/positive power rail of the Mega 2560's</w:t>
+      </w:r>
+      <w:r>
+        <w:rPr>
+          <w:b/>
+          <w:bCs/>
+          <w:color w:val="FF0000"/>
+        </w:rPr>
+        <w:t xml:space="preserve"> 5v</w:t>
+      </w:r>
+      <w:r>
+        <w:rPr>
+          <w:b/>
+          <w:bCs/>
+          <w:color w:val="FF0000"/>
+        </w:rPr>
+        <w:t xml:space="preserve"> breadboard to the</w:t>
+      </w:r>
+      <w:r>
+        <w:rPr>
+          <w:b/>
+          <w:bCs/>
+          <w:color w:val="FF0000"/>
+        </w:rPr>
+        <w:t xml:space="preserve"> </w:t>
+      </w:r>
+      <w:r>
+        <w:rPr>
+          <w:b/>
+          <w:bCs/>
+          <w:color w:val="FF0000"/>
+        </w:rPr>
+        <w:t xml:space="preserve">VCC/positive power rail of the ESP32's </w:t>
+      </w:r>
+      <w:r>
+        <w:rPr>
+          <w:b/>
+          <w:bCs/>
+          <w:color w:val="FF0000"/>
+        </w:rPr>
+        <w:t xml:space="preserve">3.3v </w:t>
+      </w:r>
+      <w:r>
+        <w:rPr>
+          <w:b/>
+          <w:bCs/>
+          <w:color w:val="FF0000"/>
+        </w:rPr>
+        <w:t>breadboard.</w:t>
       </w:r>
       <w:r>
         <w:rPr>
           <w:color w:val="FF0000"/>
         </w:rPr>
-        <w:t xml:space="preserve"> The Mega 2560 uses 5v logic, while the ESP32 uses 3.3v logic. Note that in this tutorial, they are electrically connected together with level shifters, so the two GNDs must be connected.</w:t>
+        <w:t xml:space="preserve"> </w:t>
       </w:r>
     </w:p>
     <w:p>
@@ -327,7 +384,13 @@
         <w:spacing w:line="240" w:lineRule="auto"/>
       </w:pPr>
       <w:r>
-        <w:t>For this experiment, the Arduino Mega 2560 operates at 5v and the ESP32 operates at approximately 3.3v. Both devices use digital signals to represent binary data. A digital LOW is represented by a voltage near 0v, while a digital HIGH is represented by a higher voltage. The important point is that the acceptable voltage for a HIGH depends on the receiving device.</w:t>
+        <w:t xml:space="preserve">For this </w:t>
+      </w:r>
+      <w:r>
+        <w:t>tutorial</w:t>
+      </w:r>
+      <w:r>
+        <w:t>, the Arduino Mega 2560 operates at 5v and the ESP32 operates at approximately 3.3v. Both devices use digital signals to represent binary data. A digital LOW is represented by a voltage near 0v, while a digital HIGH is represented by a higher voltage. The important point is that the acceptable voltage for a HIGH depends on the receiving device.</w:t>
       </w:r>
     </w:p>
     <w:p>
@@ -335,7 +398,11 @@
         <w:spacing w:line="240" w:lineRule="auto"/>
       </w:pPr>
       <w:r>
-        <w:t>The important point is that 5v and 3.3v are not interchangeable logic levels. A 3.3v output can be acceptable to some 5v inputs, while a 5v output may not be safe for a 3.3v input. Always determine the electrical requirements of both sides before connecting a signal between systems that use different logic voltages. In this tutorial, the ESP32 GPIO pins are designed for approximately 3.3v operation, so a voltage above the ESP32's specified input limit can damage its GPIO.</w:t>
+        <w:t xml:space="preserve">The important point is that 5v and 3.3v are not interchangeable logic levels. A 3.3v output can be acceptable to some 5v inputs, while a 5v output may not be safe for a 3.3v input. Always determine the electrical requirements of both </w:t>
+      </w:r>
+      <w:r>
+        <w:lastRenderedPageBreak/>
+        <w:t>sides before connecting a signal between systems that use different logic voltages. In this tutorial, the ESP32 GPIO pins are designed for approximately 3.3v operation, so a voltage above the ESP32's specified input limit can damage its GPIO.</w:t>
       </w:r>
     </w:p>
     <w:p>
@@ -343,7 +410,6 @@
         <w:spacing w:line="240" w:lineRule="auto"/>
       </w:pPr>
       <w:r>
-        <w:lastRenderedPageBreak/>
         <w:t>The Arduino Mega 2560, on the other hand, is designed to operate with 5v logic. Therefore, simply connecting every corresponding signal between the two processors would not be safe.</w:t>
       </w:r>
     </w:p>
@@ -356,16 +422,13 @@
       </w:r>
     </w:p>
     <w:p>
-      <w:pPr>
-        <w:pStyle w:val="Normal"/>
-      </w:pPr>
       <w:r>
         <w:t>The signal connections for this tutorial are:</w:t>
       </w:r>
     </w:p>
     <w:p>
       <w:pPr>
-        <w:pStyle w:val="Normal"/>
+        <w:pStyle w:val="ListBullet3"/>
       </w:pPr>
       <w:r>
         <w:t>ESP32 TX2 → Mega RX1</w:t>
@@ -373,7 +436,7 @@
     </w:p>
     <w:p>
       <w:pPr>
-        <w:pStyle w:val="Normal"/>
+        <w:pStyle w:val="ListBullet3"/>
       </w:pPr>
       <w:r>
         <w:t>Mega TX1 → ESP32 RX2 through the resistor divider</w:t>
@@ -381,16 +444,13 @@
     </w:p>
     <w:p>
       <w:pPr>
-        <w:pStyle w:val="Normal"/>
+        <w:pStyle w:val="ListBullet3"/>
       </w:pPr>
       <w:r>
         <w:t>Do not connect TX to TX or RX to RX.</w:t>
       </w:r>
     </w:p>
     <w:p>
-      <w:pPr>
-        <w:pStyle w:val="Normal"/>
-      </w:pPr>
       <w:r>
         <w:t>TX means transmit data, and RX means receive data. In a UART connection, the transmitter's TX signal connects to the receiver's RX input.</w:t>
       </w:r>
@@ -416,15 +476,6 @@
       </w:r>
     </w:p>
     <w:p>
-      <w:r>
-        <w:t>ESP32 TX2  ───────────────────────────────&gt; Mega 2560 RX1</w:t>
-      </w:r>
-      <w:proofErr w:type="gramStart"/>
-      <w:r/>
-      <w:proofErr w:type="gramEnd"/>
-      <w:r/>
-    </w:p>
-    <w:p>
       <w:pPr>
         <w:spacing w:line="240" w:lineRule="auto"/>
       </w:pPr>
@@ -475,15 +526,6 @@
         </w:rPr>
         <w:t>Data traveling from the Arduino to the ESP32</w:t>
       </w:r>
-    </w:p>
-    <w:p>
-      <w:r>
-        <w:t>Mega 2560 TX1  ────────────────────────────────&gt; ESP32 RX2</w:t>
-      </w:r>
-      <w:proofErr w:type="gramStart"/>
-      <w:r/>
-      <w:proofErr w:type="gramEnd"/>
-      <w:r/>
     </w:p>
     <w:p>
       <w:pPr>
@@ -534,25 +576,16 @@
       </w:r>
     </w:p>
     <w:p>
-      <w:pPr>
-        <w:pStyle w:val="Normal"/>
-      </w:pPr>
       <w:r>
         <w:t>For these resistor values, a 5v input is reduced to approximately 3.33v:</w:t>
       </w:r>
     </w:p>
     <w:p>
-      <w:pPr>
-        <w:pStyle w:val="Normal"/>
-      </w:pPr>
       <w:r>
         <w:t>5v × 2 kΩ / (1 kΩ + 2 kΩ) ≈ 3.33v</w:t>
       </w:r>
     </w:p>
     <w:p>
-      <w:pPr>
-        <w:pStyle w:val="Normal"/>
-      </w:pPr>
       <w:r>
         <w:t>Important: The resistor divider is required only in the Mega TX1 → ESP32 RX2 direction. Do not place the divider in the ESP32 TX2 → Mega RX1 path.</w:t>
       </w:r>
@@ -566,52 +599,38 @@
       </w:r>
     </w:p>
     <w:p/>
-    <w:p/>
-    <w:p/>
-    <w:p/>
-    <w:p/>
-    <w:p/>
-    <w:p/>
-    <w:p/>
-    <w:p/>
-    <w:p/>
-    <w:p>
-      <w:pPr>
-        <w:tabs>
-          <w:tab w:val="left" w:pos="2442"/>
-        </w:tabs>
-      </w:pPr>
-      <w:r>
-        <w:tab/>
-      </w:r>
-    </w:p>
     <w:p>
       <w:pPr>
         <w:pStyle w:val="Heading3"/>
         <w:spacing w:line="240" w:lineRule="auto"/>
-      </w:pPr>
-      <w:r>
         <w:rPr>
           <w:rFonts w:ascii="Calibri" w:eastAsia="Calibri" w:hAnsi="Calibri" w:cs="Calibri"/>
         </w:rPr>
-        <w:lastRenderedPageBreak/>
+      </w:pPr>
+      <w:r>
+        <w:rPr>
+          <w:rFonts w:ascii="Calibri" w:eastAsia="Calibri" w:hAnsi="Calibri" w:cs="Calibri"/>
+        </w:rPr>
         <w:t>Complete interface</w:t>
       </w:r>
     </w:p>
+    <w:p/>
     <w:p>
       <w:pPr>
         <w:pStyle w:val="Code"/>
         <w:spacing w:line="240" w:lineRule="auto"/>
+        <w:jc w:val="center"/>
       </w:pPr>
       <w:r>
         <w:rPr>
           <w:noProof/>
         </w:rPr>
+        <w:lastRenderedPageBreak/>
         <w:drawing>
-          <wp:inline distT="0" distB="0" distL="0" distR="0" wp14:anchorId="153172A8" wp14:editId="2508658F">
+          <wp:inline distT="0" distB="0" distL="0" distR="0" wp14:anchorId="62BE2D4D" wp14:editId="07F20854">
             <wp:extent cx="6400800" cy="3200400"/>
             <wp:effectExtent l="0" t="0" r="0" b="0"/>
-            <wp:docPr id="1" name="Picture 2"/>
+            <wp:docPr id="2" name="Picture 2"/>
             <wp:cNvGraphicFramePr>
               <a:graphicFrameLocks xmlns:a="http://schemas.openxmlformats.org/drawingml/2006/main" noChangeAspect="1"/>
             </wp:cNvGraphicFramePr>
@@ -619,18 +638,22 @@
               <a:graphicData uri="http://schemas.openxmlformats.org/drawingml/2006/picture">
                 <pic:pic xmlns:pic="http://schemas.openxmlformats.org/drawingml/2006/picture">
                   <pic:nvPicPr>
-                    <pic:cNvPr id="1" name="Picture 2"/>
-                    <pic:cNvPicPr>
-                      <a:picLocks noChangeAspect="1" noChangeArrowheads="1"/>
-                    </pic:cNvPicPr>
+                    <pic:cNvPr id="2" name="Picture 2"/>
+                    <pic:cNvPicPr/>
                   </pic:nvPicPr>
                   <pic:blipFill>
-                    <a:blip r:embed="rId8"/>
+                    <a:blip r:embed="rId8">
+                      <a:extLst>
+                        <a:ext uri="{28A0092B-C50C-407E-A947-70E740481C1C}">
+                          <a14:useLocalDpi xmlns:a14="http://schemas.microsoft.com/office/drawing/2010/main" val="0"/>
+                        </a:ext>
+                      </a:extLst>
+                    </a:blip>
                     <a:stretch>
                       <a:fillRect/>
                     </a:stretch>
                   </pic:blipFill>
-                  <pic:spPr bwMode="auto">
+                  <pic:spPr>
                     <a:xfrm>
                       <a:off x="0" y="0"/>
                       <a:ext cx="6400800" cy="3200400"/>
@@ -638,7 +661,6 @@
                     <a:prstGeom prst="rect">
                       <a:avLst/>
                     </a:prstGeom>
-                    <a:noFill/>
                   </pic:spPr>
                 </pic:pic>
               </a:graphicData>
@@ -649,76 +671,35 @@
     </w:p>
     <w:p>
       <w:pPr>
+        <w:tabs>
+          <w:tab w:val="left" w:pos="3754"/>
+        </w:tabs>
         <w:spacing w:line="240" w:lineRule="auto"/>
+        <w:jc w:val="center"/>
         <w:rPr>
           <w:b/>
+          <w:bCs/>
           <w:color w:val="FF0000"/>
         </w:rPr>
       </w:pPr>
+      <w:r>
+        <w:rPr>
+          <w:b/>
+          <w:bCs/>
+          <w:color w:val="FF0000"/>
+        </w:rPr>
+        <w:t>DO NOT connect the ESP32 VCC/3.3v supply to the Mega 2560 5v supply</w:t>
+      </w:r>
     </w:p>
     <w:p>
       <w:pPr>
         <w:spacing w:line="240" w:lineRule="auto"/>
-        <w:rPr>
-          <w:color w:val="FF0000"/>
-        </w:rPr>
-      </w:pPr>
-      <w:r>
-        <w:rPr>
-          <w:b/>
-          <w:color w:val="FF0000"/>
-        </w:rPr>
-        <w:t>DO NOT CONNECT THE POWER SUPPLIES TOGETHER</w:t>
+      </w:pPr>
+      <w:r>
+        <w:t>For this tutorial, each microcontroller is powered independently through its own USB connection. The only power-related connection between the two systems is their common GND. It is important that the two processors share a common ground. Connect GND of the ESP32 to the GND of the Mega 2560, but do NOT connect 5v to 3.3v.</w:t>
       </w:r>
     </w:p>
     <w:p>
-      <w:pPr>
-        <w:numPr>
-          <w:ilvl w:val="0"/>
-          <w:numId w:val="3"/>
-        </w:numPr>
-        <w:spacing w:line="240" w:lineRule="auto"/>
-      </w:pPr>
-      <w:r>
-        <w:t>DO NOT connect ESP32 3.3v to Arduino 5v.</w:t>
-      </w:r>
-    </w:p>
-    <w:p>
-      <w:pPr>
-        <w:numPr>
-          <w:ilvl w:val="0"/>
-          <w:numId w:val="3"/>
-        </w:numPr>
-        <w:spacing w:line="240" w:lineRule="auto"/>
-      </w:pPr>
-      <w:r>
-        <w:t>DO NOT connect the ESP32 VCC/3.3v supply to the Mega 2560 5v supply.</w:t>
-      </w:r>
-    </w:p>
-    <w:p>
-      <w:pPr>
-        <w:numPr>
-          <w:ilvl w:val="0"/>
-          <w:numId w:val="3"/>
-        </w:numPr>
-        <w:spacing w:line="240" w:lineRule="auto"/>
-      </w:pPr>
-      <w:r>
-        <w:t>DO NOT use the serial connection as a way to power either processor.</w:t>
-      </w:r>
-    </w:p>
-    <w:p>
-      <w:pPr>
-        <w:spacing w:line="240" w:lineRule="auto"/>
-      </w:pPr>
-      <w:r>
-        <w:t>For this tutorial, each microcontroller is powered independently through its own USB connection. The only power-related connection between the two systems is their common GND. It is important that the two processors share a common ground. Connect GND of the ESP32 to the GND of the Mega 2560, but do NOT connect 5v to 3.3v.</w:t>
-      </w:r>
-    </w:p>
-    <w:p>
-      <w:pPr>
-        <w:pStyle w:val="Normal"/>
-      </w:pPr>
       <w:r>
         <w:t>The USB connection to the computer is used to power, program, and monitor each development board. It is separate from the UART connection being tested between the Mega and ESP32.</w:t>
       </w:r>
@@ -740,7 +721,13 @@
         <w:rPr>
           <w:rFonts w:ascii="Calibri" w:eastAsia="Calibri" w:hAnsi="Calibri" w:cs="Calibri"/>
         </w:rPr>
-        <w:t>Part 2 — First Test</w:t>
+        <w:t xml:space="preserve">Part 2 — </w:t>
+      </w:r>
+      <w:r>
+        <w:rPr>
+          <w:rFonts w:ascii="Calibri" w:eastAsia="Calibri" w:hAnsi="Calibri" w:cs="Calibri"/>
+        </w:rPr>
+        <w:t>Serial Communications from the Mega to the ESP32</w:t>
       </w:r>
     </w:p>
     <w:p>
@@ -793,7 +780,6 @@
       </w:pPr>
       <w:bookmarkStart w:id="0" w:name="_Hlk240119574"/>
       <w:r>
-        <w:lastRenderedPageBreak/>
         <w:t>// Arduino Mega 2560 transmitter</w:t>
       </w:r>
       <w:r>
@@ -865,6 +851,7 @@
         <w:rPr>
           <w:rFonts w:ascii="Calibri" w:eastAsia="Calibri" w:hAnsi="Calibri" w:cs="Calibri"/>
         </w:rPr>
+        <w:lastRenderedPageBreak/>
         <w:t>ESP32 — Receiver</w:t>
       </w:r>
     </w:p>
@@ -890,59 +877,85 @@
       </w:pPr>
       <w:r>
         <w:t>// ESP32 receiver</w:t>
+      </w:r>
+      <w:r>
         <w:br/>
+      </w:r>
+      <w:r>
         <w:br/>
-        <w:t>void setup()</w:t>
+        <w:t xml:space="preserve">void </w:t>
+      </w:r>
+      <w:proofErr w:type="gramStart"/>
+      <w:r>
+        <w:t>setup(</w:t>
+      </w:r>
+      <w:proofErr w:type="gramEnd"/>
+      <w:r>
+        <w:t>)</w:t>
+      </w:r>
+      <w:r>
         <w:br/>
         <w:t>{</w:t>
+      </w:r>
+      <w:r>
         <w:br/>
-        <w:t xml:space="preserve">    Serial.begin(115200);</w:t>
+        <w:t xml:space="preserve">    </w:t>
+      </w:r>
+      <w:proofErr w:type="spellStart"/>
+      <w:r>
+        <w:t>Serial.begin</w:t>
+      </w:r>
+      <w:proofErr w:type="spellEnd"/>
+      <w:r>
+        <w:t>(115200);</w:t>
+      </w:r>
+      <w:r>
         <w:br/>
         <w:t xml:space="preserve">    Serial2.begin(9600, SERIAL_8N1, 16, 17);</w:t>
+      </w:r>
+      <w:r>
         <w:br/>
         <w:t>}</w:t>
+      </w:r>
+      <w:r>
         <w:br/>
+      </w:r>
+      <w:r>
         <w:br/>
         <w:t>void loop()</w:t>
+      </w:r>
+      <w:r>
         <w:br/>
         <w:t>{</w:t>
+      </w:r>
+      <w:r>
         <w:br/>
         <w:t xml:space="preserve">    while (Serial2.available())</w:t>
+      </w:r>
+      <w:r>
         <w:br/>
         <w:t xml:space="preserve">    {</w:t>
+      </w:r>
+      <w:r>
         <w:br/>
-        <w:t xml:space="preserve">        Serial.write(Serial2.read());</w:t>
+        <w:t xml:space="preserve">        </w:t>
+      </w:r>
+      <w:proofErr w:type="spellStart"/>
+      <w:r>
+        <w:t>Serial.write</w:t>
+      </w:r>
+      <w:proofErr w:type="spellEnd"/>
+      <w:r>
+        <w:t>(Serial2.read());</w:t>
+      </w:r>
+      <w:r>
         <w:br/>
         <w:t xml:space="preserve">    }</w:t>
+      </w:r>
+      <w:r>
         <w:br/>
         <w:t>}</w:t>
       </w:r>
-      <w:r/>
-      <w:r/>
-      <w:proofErr w:type="gramStart"/>
-      <w:r/>
-      <w:proofErr w:type="gramEnd"/>
-      <w:r/>
-      <w:r/>
-      <w:r/>
-      <w:proofErr w:type="spellStart"/>
-      <w:r/>
-      <w:proofErr w:type="spellEnd"/>
-      <w:r/>
-      <w:r/>
-      <w:r/>
-      <w:r/>
-      <w:r/>
-      <w:r/>
-      <w:r/>
-      <w:r/>
-      <w:r/>
-      <w:proofErr w:type="spellStart"/>
-      <w:r/>
-      <w:proofErr w:type="spellEnd"/>
-      <w:r/>
-      <w:r/>
-      <w:r/>
     </w:p>
     <w:p>
       <w:pPr>
@@ -1009,18 +1022,6 @@
       <w:pPr>
         <w:pBdr>
           <w:left w:val="single" w:sz="8" w:space="4" w:color="000000"/>
-          <w:right w:val="single" w:sz="8" w:space="4" w:color="000000"/>
-        </w:pBdr>
-        <w:spacing w:line="240" w:lineRule="auto"/>
-      </w:pPr>
-      <w:r>
-        <w:t>Hello from Mega 2560</w:t>
-      </w:r>
-    </w:p>
-    <w:p>
-      <w:pPr>
-        <w:pBdr>
-          <w:left w:val="single" w:sz="8" w:space="4" w:color="000000"/>
           <w:bottom w:val="single" w:sz="8" w:space="4" w:color="000000"/>
           <w:right w:val="single" w:sz="8" w:space="4" w:color="000000"/>
         </w:pBdr>
@@ -1047,7 +1048,7 @@
         <w:rPr>
           <w:rFonts w:ascii="Calibri" w:eastAsia="Calibri" w:hAnsi="Calibri" w:cs="Calibri"/>
         </w:rPr>
-        <w:t>Part 3 — Test Communication Reliability and Both Directions</w:t>
+        <w:t>Part 3 — Serial Communications from the ESP32 to the Mega</w:t>
       </w:r>
     </w:p>
     <w:p>
@@ -1055,7 +1056,7 @@
         <w:spacing w:line="240" w:lineRule="auto"/>
       </w:pPr>
       <w:r>
-        <w:t>The first test demonstrated Arduino Mega 2560 → ESP32. Now test the opposite direction.</w:t>
+        <w:t>The first test demonstrated communication from the Arduino Mega 2560 to the ESP32. Now test the communication in the opposite direction.</w:t>
       </w:r>
     </w:p>
     <w:p>
@@ -1063,7 +1064,32 @@
         <w:spacing w:line="240" w:lineRule="auto"/>
       </w:pPr>
       <w:r>
-        <w:t>Modify the programs so that the ESP32 transmits through Serial2 and the Mega 2560 receives through Serial1.</w:t>
+        <w:rPr>
+          <w:b/>
+          <w:bCs/>
+        </w:rPr>
+        <w:t xml:space="preserve">Test ESP32 </w:t>
+      </w:r>
+      <w:r>
+        <w:rPr>
+          <w:b/>
+          <w:bCs/>
+        </w:rPr>
+        <w:t xml:space="preserve">TX2 </w:t>
+      </w:r>
+      <w:r>
+        <w:rPr>
+          <w:b/>
+          <w:bCs/>
+        </w:rPr>
+        <w:t>→ Mega</w:t>
+      </w:r>
+      <w:r>
+        <w:rPr>
+          <w:b/>
+          <w:bCs/>
+        </w:rPr>
+        <w:t xml:space="preserve"> RX1</w:t>
       </w:r>
     </w:p>
     <w:p>
@@ -1071,7 +1097,7 @@
         <w:spacing w:line="240" w:lineRule="auto"/>
       </w:pPr>
       <w:r>
-        <w:t>The signal path is now ESP32 TX2 → Mega 2560 RX1.</w:t>
+        <w:t>Modify the programs so that the ESP32 transmits through Serial2 and the Mega 2560 receives through Serial1.</w:t>
       </w:r>
     </w:p>
     <w:p>
@@ -1079,7 +1105,13 @@
         <w:spacing w:line="240" w:lineRule="auto"/>
       </w:pPr>
       <w:r>
-        <w:t>Remember that this direction does not require the resistor divider. The ESP32's approximately 3.3v HIGH is sufficient for the Mega 2560's input.</w:t>
+        <w:t>This direction does not require the resistor divider. The ESP32's approximately 3.3v HIGH is sufficient for the Mega 2560's input.</w:t>
+      </w:r>
+      <w:r>
+        <w:t xml:space="preserve"> </w:t>
+      </w:r>
+      <w:r>
+        <w:t>Have the ESP32 send a short message such as "Hello from ESP32" through Serial2. Have the Mega receive the message through Serial1 and display it through its USB serial connection.</w:t>
       </w:r>
     </w:p>
     <w:p>
@@ -1087,57 +1119,7 @@
         <w:spacing w:line="240" w:lineRule="auto"/>
       </w:pPr>
       <w:r>
-        <w:t>Have the ESP32 send a short message such as "Hello from ESP32" through Serial2. Have the Mega receive it through Serial1 and display the received message through its USB serial connection.</w:t>
-      </w:r>
-    </w:p>
-    <w:p>
-      <w:pPr>
-        <w:spacing w:line="240" w:lineRule="auto"/>
-      </w:pPr>
-      <w:r>
-        <w:t>Have each processor periodically send a message identifying itself.</w:t>
-      </w:r>
-    </w:p>
-    <w:p>
-      <w:pPr>
-        <w:spacing w:line="240" w:lineRule="auto"/>
-      </w:pPr>
-      <w:r>
-        <w:t>Observe both directions independently.</w:t>
-      </w:r>
-    </w:p>
-    <w:p>
-      <w:pPr>
-        <w:spacing w:line="240" w:lineRule="auto"/>
-      </w:pPr>
-      <w:r>
-        <w:t>Modify the programs so that communication works in both directions. Have the Mega 2560 transmit "Hello from Mega 2560" and the ESP32 transmit "Hello from ESP32". Observe the two directions independently.</w:t>
-      </w:r>
-    </w:p>
-    <w:p>
-      <w:pPr>
-        <w:pBdr>
-          <w:top w:val="single" w:sz="8" w:space="4" w:color="000000"/>
-          <w:left w:val="single" w:sz="8" w:space="4" w:color="000000"/>
-          <w:right w:val="single" w:sz="8" w:space="4" w:color="000000"/>
-        </w:pBdr>
-        <w:spacing w:line="240" w:lineRule="auto"/>
-      </w:pPr>
-      <w:r>
-        <w:t>Mega 2560: Hello from Mega 2560</w:t>
-      </w:r>
-    </w:p>
-    <w:p>
-      <w:pPr>
-        <w:pBdr>
-          <w:left w:val="single" w:sz="8" w:space="4" w:color="000000"/>
-          <w:bottom w:val="single" w:sz="8" w:space="4" w:color="000000"/>
-          <w:right w:val="single" w:sz="8" w:space="4" w:color="000000"/>
-        </w:pBdr>
-        <w:spacing w:line="240" w:lineRule="auto"/>
-      </w:pPr>
-      <w:r>
-        <w:t>ESP32: Hello from ESP32</w:t>
+        <w:t>Verify that the message is received correctly.</w:t>
       </w:r>
     </w:p>
     <w:p>
@@ -1149,61 +1131,27 @@
         <w:rPr>
           <w:rFonts w:ascii="Calibri" w:eastAsia="Calibri" w:hAnsi="Calibri" w:cs="Calibri"/>
         </w:rPr>
-        <w:t>Part 4 — Experiment with the Electrical Interface</w:t>
-      </w:r>
-    </w:p>
-    <w:p>
-      <w:pPr>
-        <w:spacing w:line="240" w:lineRule="auto"/>
-      </w:pPr>
-      <w:r>
-        <w:t>Now that the basic connection works, deliberately change one part of the system at a time.</w:t>
-      </w:r>
-    </w:p>
-    <w:p>
-      <w:pPr>
-        <w:pStyle w:val="Heading3"/>
-        <w:spacing w:line="240" w:lineRule="auto"/>
-      </w:pPr>
+        <w:t xml:space="preserve">Part 4 — Now Let’s Send Messages </w:t>
+      </w:r>
+      <w:proofErr w:type="gramStart"/>
       <w:r>
         <w:rPr>
           <w:rFonts w:ascii="Calibri" w:eastAsia="Calibri" w:hAnsi="Calibri" w:cs="Calibri"/>
         </w:rPr>
-        <w:t>Experiment 1 — Disconnect the common ground</w:t>
-      </w:r>
+        <w:t>In</w:t>
+      </w:r>
+      <w:proofErr w:type="gramEnd"/>
       <w:r>
         <w:rPr>
           <w:rFonts w:ascii="Calibri" w:eastAsia="Calibri" w:hAnsi="Calibri" w:cs="Calibri"/>
         </w:rPr>
-        <w:tab/>
-      </w:r>
-    </w:p>
-    <w:p>
-      <w:pPr>
-        <w:spacing w:line="240" w:lineRule="auto"/>
-      </w:pPr>
-      <w:r>
-        <w:t>Disconnect the wire connecting ESP32 GND and Mega 2560 GND. Observe what happens to the communication. Then reconnect the ground.</w:t>
-      </w:r>
-    </w:p>
-    <w:p>
-      <w:pPr>
-        <w:spacing w:line="240" w:lineRule="auto"/>
-      </w:pPr>
-      <w:r>
-        <w:t>Question: Why does the signal become unreliable when the two systems no longer share the same voltage reference?</w:t>
-      </w:r>
-    </w:p>
-    <w:p>
-      <w:pPr>
-        <w:pStyle w:val="Heading3"/>
-        <w:spacing w:line="240" w:lineRule="auto"/>
-      </w:pPr>
+        <w:t xml:space="preserve"> </w:t>
+      </w:r>
       <w:r>
         <w:rPr>
           <w:rFonts w:ascii="Calibri" w:eastAsia="Calibri" w:hAnsi="Calibri" w:cs="Calibri"/>
         </w:rPr>
-        <w:t>Experiment 2 — Change the baud rate</w:t>
+        <w:t>Both Directions</w:t>
       </w:r>
     </w:p>
     <w:p>
@@ -1211,7 +1159,19 @@
         <w:spacing w:line="240" w:lineRule="auto"/>
       </w:pPr>
       <w:r>
-        <w:t>Test 1200, 2400, 4800, and 9600 baud. Make sure both processors are changed to the same baud rate. Then deliberately configure the two processors for different baud rates, such as Mega 2560: 9600 and ESP32: 4800. Also try setting the baud rates of both processors to different rates. Observe the result.</w:t>
+        <w:t xml:space="preserve">You have now tested each direction of communication separately. </w:t>
+      </w:r>
+      <w:r>
+        <w:t>Now m</w:t>
+      </w:r>
+      <w:r>
+        <w:t>odify the programs so that both processors periodically transmit a message identifying themselves.</w:t>
+      </w:r>
+      <w:r>
+        <w:t xml:space="preserve"> </w:t>
+      </w:r>
+      <w:r>
+        <w:t>The Mega should transmit "Hello from Mega 2560" and the ESP32 should transmit "Hello from ESP32".</w:t>
       </w:r>
     </w:p>
     <w:p>
@@ -1219,67 +1179,19 @@
         <w:spacing w:line="240" w:lineRule="auto"/>
       </w:pPr>
       <w:r>
-        <w:t>Question: Why must both processors agree on the baud rate?</w:t>
+        <w:t>Observe the messages received by each processor and verify that communication works in both directions at the same time.</w:t>
       </w:r>
     </w:p>
     <w:p>
       <w:pPr>
-        <w:pStyle w:val="Heading3"/>
+        <w:pStyle w:val="Heading1"/>
         <w:spacing w:line="240" w:lineRule="auto"/>
       </w:pPr>
       <w:r>
         <w:rPr>
           <w:rFonts w:ascii="Calibri" w:eastAsia="Calibri" w:hAnsi="Calibri" w:cs="Calibri"/>
         </w:rPr>
-        <w:t>Experiment 3 — Send Longer Messages</w:t>
-      </w:r>
-    </w:p>
-    <w:p>
-      <w:pPr>
-        <w:spacing w:line="240" w:lineRule="auto"/>
-      </w:pPr>
-      <w:r>
-        <w:t>Change the transmitted message to something longer.</w:t>
-      </w:r>
-    </w:p>
-    <w:p>
-      <w:pPr>
-        <w:spacing w:line="240" w:lineRule="auto"/>
-      </w:pPr>
-      <w:proofErr w:type="spellStart"/>
-      <w:r>
-        <w:t>SoutheastCon</w:t>
-      </w:r>
-      <w:proofErr w:type="spellEnd"/>
-      <w:r>
-        <w:t xml:space="preserve"> Communication Test — Arduino Mega 2560 to ESP32</w:t>
-      </w:r>
-    </w:p>
-    <w:p>
-      <w:pPr>
-        <w:spacing w:line="240" w:lineRule="auto"/>
-      </w:pPr>
-      <w:r>
-        <w:t>Observe whether the entire message is received correctly. Then try sending several messages rapidly.</w:t>
-      </w:r>
-    </w:p>
-    <w:p>
-      <w:pPr>
-        <w:spacing w:line="240" w:lineRule="auto"/>
-      </w:pPr>
-      <w:r>
-        <w:t>Question: What happens when the transmitter sends data faster than the receiver can process it?</w:t>
-      </w:r>
-    </w:p>
-    <w:p>
-      <w:pPr>
-        <w:pStyle w:val="Heading1"/>
-        <w:spacing w:line="240" w:lineRule="auto"/>
-      </w:pPr>
-      <w:r>
-        <w:rPr>
-          <w:rFonts w:ascii="Calibri" w:eastAsia="Calibri" w:hAnsi="Calibri" w:cs="Calibri"/>
-        </w:rPr>
+        <w:lastRenderedPageBreak/>
         <w:t>What You Should Understand</w:t>
       </w:r>
     </w:p>
@@ -1457,7 +1369,13 @@
         <w:spacing w:after="0" w:line="240" w:lineRule="auto"/>
       </w:pPr>
       <w:r>
-        <w:t>Each processor can be powered independently.</w:t>
+        <w:t xml:space="preserve">Each processor </w:t>
+      </w:r>
+      <w:r>
+        <w:t>should</w:t>
+      </w:r>
+      <w:r>
+        <w:t xml:space="preserve"> be powered independently.</w:t>
       </w:r>
     </w:p>
     <w:p>
@@ -1487,150 +1405,132 @@
     </w:p>
     <w:p>
       <w:pPr>
-        <w:numPr>
-          <w:ilvl w:val="0"/>
-          <w:numId w:val="3"/>
-        </w:numPr>
         <w:spacing w:line="240" w:lineRule="auto"/>
       </w:pPr>
       <w:r>
-        <w:t>I can explain what UART serial communication is.</w:t>
+        <w:rPr>
+          <w:rFonts w:ascii="Segoe UI Symbol" w:hAnsi="Segoe UI Symbol" w:cs="Segoe UI Symbol"/>
+        </w:rPr>
+        <w:t>☐</w:t>
+      </w:r>
+      <w:r>
+        <w:t xml:space="preserve"> I understand why both processors must use the same baud rate.</w:t>
       </w:r>
     </w:p>
     <w:p>
       <w:pPr>
-        <w:numPr>
-          <w:ilvl w:val="0"/>
-          <w:numId w:val="3"/>
-        </w:numPr>
         <w:spacing w:line="240" w:lineRule="auto"/>
       </w:pPr>
       <w:r>
-        <w:t>I understand why TX connects to RX.</w:t>
+        <w:rPr>
+          <w:rFonts w:ascii="Segoe UI Symbol" w:hAnsi="Segoe UI Symbol" w:cs="Segoe UI Symbol"/>
+        </w:rPr>
+        <w:t>☐</w:t>
+      </w:r>
+      <w:r>
+        <w:t xml:space="preserve"> I can explain the difference between 5v and 3.3v logic.</w:t>
       </w:r>
     </w:p>
     <w:p>
       <w:pPr>
-        <w:numPr>
-          <w:ilvl w:val="0"/>
-          <w:numId w:val="3"/>
-        </w:numPr>
         <w:spacing w:line="240" w:lineRule="auto"/>
       </w:pPr>
       <w:r>
-        <w:t>I understand why both processors must use the same baud rate.</w:t>
+        <w:rPr>
+          <w:rFonts w:ascii="Segoe UI Symbol" w:hAnsi="Segoe UI Symbol" w:cs="Segoe UI Symbol"/>
+        </w:rPr>
+        <w:t>☐</w:t>
+      </w:r>
+      <w:r>
+        <w:t xml:space="preserve"> I can explain why the ESP32 TX can connect directly to the Mega 2560 RX.</w:t>
       </w:r>
     </w:p>
     <w:p>
       <w:pPr>
-        <w:numPr>
-          <w:ilvl w:val="0"/>
-          <w:numId w:val="3"/>
-        </w:numPr>
         <w:spacing w:line="240" w:lineRule="auto"/>
       </w:pPr>
       <w:r>
-        <w:t>I can explain the difference between 5v and 3.3v logic.</w:t>
+        <w:rPr>
+          <w:rFonts w:ascii="Segoe UI Symbol" w:hAnsi="Segoe UI Symbol" w:cs="Segoe UI Symbol"/>
+        </w:rPr>
+        <w:t>☐</w:t>
+      </w:r>
+      <w:r>
+        <w:t xml:space="preserve"> I can explain why the Mega 2560 TX cannot connect directly to the ESP32 RX.</w:t>
       </w:r>
     </w:p>
     <w:p>
       <w:pPr>
-        <w:numPr>
-          <w:ilvl w:val="0"/>
-          <w:numId w:val="3"/>
-        </w:numPr>
         <w:spacing w:line="240" w:lineRule="auto"/>
       </w:pPr>
       <w:r>
-        <w:t>I can explain why the ESP32 TX can connect directly to the Mega 2560 RX.</w:t>
+        <w:rPr>
+          <w:rFonts w:ascii="Segoe UI Symbol" w:hAnsi="Segoe UI Symbol" w:cs="Segoe UI Symbol"/>
+        </w:rPr>
+        <w:t>☐</w:t>
+      </w:r>
+      <w:r>
+        <w:t xml:space="preserve"> I understand that the voltage divider reduces the Mega 2560's approximately 5v signal to approximately 3.3v.</w:t>
       </w:r>
     </w:p>
     <w:p>
       <w:pPr>
-        <w:numPr>
-          <w:ilvl w:val="0"/>
-          <w:numId w:val="3"/>
-        </w:numPr>
         <w:spacing w:line="240" w:lineRule="auto"/>
       </w:pPr>
       <w:r>
-        <w:t>I can explain why the Mega 2560 TX cannot connect directly to the ESP32 RX.</w:t>
+        <w:rPr>
+          <w:rFonts w:ascii="Segoe UI Symbol" w:hAnsi="Segoe UI Symbol" w:cs="Segoe UI Symbol"/>
+        </w:rPr>
+        <w:t>☐</w:t>
+      </w:r>
+      <w:r>
+        <w:t xml:space="preserve"> I understand why the two processor grounds must be connected.</w:t>
       </w:r>
     </w:p>
     <w:p>
       <w:pPr>
-        <w:numPr>
-          <w:ilvl w:val="0"/>
-          <w:numId w:val="3"/>
-        </w:numPr>
         <w:spacing w:line="240" w:lineRule="auto"/>
       </w:pPr>
       <w:r>
-        <w:t>I can identify the 1 kΩ and 2 kΩ resistors in the voltage divider.</w:t>
+        <w:rPr>
+          <w:rFonts w:ascii="Segoe UI Symbol" w:hAnsi="Segoe UI Symbol" w:cs="Segoe UI Symbol"/>
+        </w:rPr>
+        <w:t>☐</w:t>
+      </w:r>
+      <w:r>
+        <w:t xml:space="preserve"> I understand why the 5v and 3.3v power supplies must not be connected together.</w:t>
       </w:r>
     </w:p>
     <w:p>
       <w:pPr>
-        <w:numPr>
-          <w:ilvl w:val="0"/>
-          <w:numId w:val="3"/>
-        </w:numPr>
         <w:spacing w:line="240" w:lineRule="auto"/>
       </w:pPr>
       <w:r>
-        <w:t>I understand that the voltage divider reduces the Mega 2560's approximately 5v signal to approximately 3.3v.</w:t>
+        <w:rPr>
+          <w:rFonts w:ascii="Segoe UI Symbol" w:hAnsi="Segoe UI Symbol" w:cs="Segoe UI Symbol"/>
+        </w:rPr>
+        <w:t>☐</w:t>
+      </w:r>
+      <w:r>
+        <w:t xml:space="preserve"> I can communicate between the Arduino Mega 2560 and ESP32 in both directions.</w:t>
       </w:r>
     </w:p>
     <w:p>
       <w:pPr>
-        <w:numPr>
-          <w:ilvl w:val="0"/>
-          <w:numId w:val="3"/>
-        </w:numPr>
         <w:spacing w:line="240" w:lineRule="auto"/>
       </w:pPr>
       <w:r>
-        <w:t>I understand why the two processor grounds must be connected.</w:t>
+        <w:rPr>
+          <w:rFonts w:ascii="Segoe UI Symbol" w:hAnsi="Segoe UI Symbol" w:cs="Segoe UI Symbol"/>
+        </w:rPr>
+        <w:t>☐</w:t>
+      </w:r>
+      <w:r>
+        <w:t xml:space="preserve"> I can explain why both ends of a UART connection must agree on the baud rate.</w:t>
       </w:r>
     </w:p>
     <w:p>
       <w:pPr>
-        <w:numPr>
-          <w:ilvl w:val="0"/>
-          <w:numId w:val="3"/>
-        </w:numPr>
-        <w:spacing w:line="240" w:lineRule="auto"/>
-      </w:pPr>
-      <w:r>
-        <w:t>I understand why the 5v and 3.3v power supplies must not be connected together.</w:t>
-      </w:r>
-    </w:p>
-    <w:p>
-      <w:pPr>
-        <w:numPr>
-          <w:ilvl w:val="0"/>
-          <w:numId w:val="3"/>
-        </w:numPr>
-        <w:spacing w:line="240" w:lineRule="auto"/>
-      </w:pPr>
-      <w:r>
-        <w:t>I can communicate between the Arduino Mega 2560 and ESP32 in both directions.</w:t>
-      </w:r>
-    </w:p>
-    <w:p>
-      <w:pPr>
-        <w:numPr>
-          <w:ilvl w:val="0"/>
-          <w:numId w:val="3"/>
-        </w:numPr>
-        <w:spacing w:line="240" w:lineRule="auto"/>
-      </w:pPr>
-      <w:r>
-        <w:t>I can explain why both ends of a UART connection must agree on the baud rate.</w:t>
-      </w:r>
-    </w:p>
-    <w:p>
-      <w:pPr>
         <w:spacing w:line="240" w:lineRule="auto"/>
       </w:pPr>
       <w:r>
@@ -1638,8 +1538,12 @@
       </w:r>
     </w:p>
     <w:sectPr>
-      <w:footerReference w:type="default" r:id="rId9"/>
-      <w:footerReference w:type="first" r:id="rId10"/>
+      <w:headerReference w:type="even" r:id="rId9"/>
+      <w:headerReference w:type="default" r:id="rId10"/>
+      <w:footerReference w:type="even" r:id="rId11"/>
+      <w:footerReference w:type="default" r:id="rId12"/>
+      <w:headerReference w:type="first" r:id="rId13"/>
+      <w:footerReference w:type="first" r:id="rId14"/>
       <w:pgSz w:w="12240" w:h="15840"/>
       <w:pgMar w:top="936" w:right="1080" w:bottom="936" w:left="1080" w:header="720" w:footer="720" w:gutter="0"/>
       <w:cols w:space="720"/>
@@ -1677,7 +1581,7 @@
 </file>
 
 <file path=word/footer1.xml><?xml version="1.0" encoding="utf-8"?>
-<w:ftr xmlns:wpc="http://schemas.microsoft.com/office/word/2010/wordprocessingCanvas" xmlns:cx="http://schemas.microsoft.com/office/drawing/2014/chartex" xmlns:cx1="http://schemas.microsoft.com/office/drawing/2015/9/8/chartex" xmlns:cx2="http://schemas.microsoft.com/office/drawing/2015/10/21/chartex" xmlns:cx3="http://schemas.microsoft.com/office/drawing/2016/5/9/chartex" xmlns:cx4="http://schemas.microsoft.com/office/drawing/2016/5/10/chartex" xmlns:cx5="http://schemas.microsoft.com/office/drawing/2016/5/11/chartex" xmlns:cx6="http://schemas.microsoft.com/office/drawing/2016/5/12/chartex" xmlns:cx7="http://schemas.microsoft.com/office/drawing/2016/5/13/chartex" xmlns:cx8="http://schemas.microsoft.com/office/drawing/2016/5/14/chartex" xmlns:mc="http://schemas.openxmlformats.org/markup-compatibility/2006" xmlns:aink="http://schemas.microsoft.com/office/drawing/2016/ink" xmlns:am3d="http://schemas.microsoft.com/office/drawing/2017/model3d" xmlns:o="urn:schemas-microsoft-com:office:office" xmlns:oel="http://schemas.microsoft.com/office/2019/extlst" xmlns:r="http://schemas.openxmlformats.org/officeDocument/2006/relationships" xmlns:m="http://schemas.openxmlformats.org/officeDocument/2006/math" xmlns:v="urn:schemas-microsoft-com:vml" xmlns:wp14="http://schemas.microsoft.com/office/word/2010/wordprocessingDrawing" xmlns:wp="http://schemas.openxmlformats.org/drawingml/2006/wordprocessingDrawing" xmlns:w10="urn:schemas-microsoft-com:office:word" xmlns:w="http://schemas.openxmlformats.org/wordprocessingml/2006/main" xmlns:w14="http://schemas.microsoft.com/office/word/2010/wordml" xmlns:w15="http://schemas.microsoft.com/office/word/2012/wordml" xmlns:w16cex="http://schemas.microsoft.com/office/word/2018/wordml/cex" xmlns:w16cid="http://schemas.microsoft.com/office/word/2016/wordml/cid" xmlns:w16="http://schemas.microsoft.com/office/word/2018/wordml" xmlns:w16sdtdh="http://schemas.microsoft.com/office/word/2020/wordml/sdtdatahash" xmlns:w16se="http://schemas.microsoft.com/office/word/2015/wordml/symex" xmlns:wpg="http://schemas.microsoft.com/office/word/2010/wordprocessingGroup" xmlns:wpi="http://schemas.microsoft.com/office/word/2010/wordprocessingInk" xmlns:wne="http://schemas.microsoft.com/office/word/2006/wordml" xmlns:wps="http://schemas.microsoft.com/office/word/2010/wordprocessingShape" mc:Ignorable="w14 w15 w16se w16cid w16 w16cex w16sdtdh wp14">
+<w:ftr xmlns:wpc="http://schemas.microsoft.com/office/word/2010/wordprocessingCanvas" xmlns:cx="http://schemas.microsoft.com/office/drawing/2014/chartex" xmlns:cx1="http://schemas.microsoft.com/office/drawing/2015/9/8/chartex" xmlns:cx2="http://schemas.microsoft.com/office/drawing/2015/10/21/chartex" xmlns:cx3="http://schemas.microsoft.com/office/drawing/2016/5/9/chartex" xmlns:cx4="http://schemas.microsoft.com/office/drawing/2016/5/10/chartex" xmlns:cx5="http://schemas.microsoft.com/office/drawing/2016/5/11/chartex" xmlns:cx6="http://schemas.microsoft.com/office/drawing/2016/5/12/chartex" xmlns:cx7="http://schemas.microsoft.com/office/drawing/2016/5/13/chartex" xmlns:cx8="http://schemas.microsoft.com/office/drawing/2016/5/14/chartex" xmlns:mc="http://schemas.openxmlformats.org/markup-compatibility/2006" xmlns:aink="http://schemas.microsoft.com/office/drawing/2016/ink" xmlns:am3d="http://schemas.microsoft.com/office/drawing/2017/model3d" xmlns:o="urn:schemas-microsoft-com:office:office" xmlns:oel="http://schemas.microsoft.com/office/2019/extlst" xmlns:r="http://schemas.openxmlformats.org/officeDocument/2006/relationships" xmlns:m="http://schemas.openxmlformats.org/officeDocument/2006/math" xmlns:v="urn:schemas-microsoft-com:vml" xmlns:wp14="http://schemas.microsoft.com/office/word/2010/wordprocessingDrawing" xmlns:wp="http://schemas.openxmlformats.org/drawingml/2006/wordprocessingDrawing" xmlns:w10="urn:schemas-microsoft-com:office:word" xmlns:w="http://schemas.openxmlformats.org/wordprocessingml/2006/main" xmlns:w14="http://schemas.microsoft.com/office/word/2010/wordml" xmlns:w15="http://schemas.microsoft.com/office/word/2012/wordml" xmlns:w16cex="http://schemas.microsoft.com/office/word/2018/wordml/cex" xmlns:w16cid="http://schemas.microsoft.com/office/word/2016/wordml/cid" xmlns:w16="http://schemas.microsoft.com/office/word/2018/wordml" xmlns:w16sdtdh="http://schemas.microsoft.com/office/word/2020/wordml/sdtdatahash" xmlns:w16se="http://schemas.microsoft.com/office/word/2015/wordml/symex" xmlns:wpg="http://schemas.microsoft.com/office/word/2010/wordprocessingGroup" xmlns:wpi="http://schemas.microsoft.com/office/word/2010/wordprocessingInk" xmlns:wne="http://schemas.microsoft.com/office/word/2006/wordml" xmlns:wps="http://schemas.microsoft.com/office/word/2010/wordprocessingShape">
   <w:p>
     <w:pPr>
       <w:pStyle w:val="Footer"/>
@@ -1686,9 +1590,6 @@
       </w:pBdr>
       <w:spacing w:after="120"/>
       <w:jc w:val="center"/>
-      <w:rPr>
-        <w:sz w:val="18"/>
-      </w:rPr>
     </w:pPr>
     <w:r>
       <w:rPr>
@@ -1718,7 +1619,7 @@
       <w:fldChar w:fldCharType="separate"/>
     </w:r>
     <w:r>
-      <w:t>7</w:t>
+      <w:t>1</w:t>
     </w:r>
     <w:r>
       <w:fldChar w:fldCharType="end"/>
@@ -1728,6 +1629,54 @@
 </file>
 
 <file path=word/footer2.xml><?xml version="1.0" encoding="utf-8"?>
+<w:ftr xmlns:wpc="http://schemas.microsoft.com/office/word/2010/wordprocessingCanvas" xmlns:cx="http://schemas.microsoft.com/office/drawing/2014/chartex" xmlns:cx1="http://schemas.microsoft.com/office/drawing/2015/9/8/chartex" xmlns:cx2="http://schemas.microsoft.com/office/drawing/2015/10/21/chartex" xmlns:cx3="http://schemas.microsoft.com/office/drawing/2016/5/9/chartex" xmlns:cx4="http://schemas.microsoft.com/office/drawing/2016/5/10/chartex" xmlns:cx5="http://schemas.microsoft.com/office/drawing/2016/5/11/chartex" xmlns:cx6="http://schemas.microsoft.com/office/drawing/2016/5/12/chartex" xmlns:cx7="http://schemas.microsoft.com/office/drawing/2016/5/13/chartex" xmlns:cx8="http://schemas.microsoft.com/office/drawing/2016/5/14/chartex" xmlns:mc="http://schemas.openxmlformats.org/markup-compatibility/2006" xmlns:aink="http://schemas.microsoft.com/office/drawing/2016/ink" xmlns:am3d="http://schemas.microsoft.com/office/drawing/2017/model3d" xmlns:o="urn:schemas-microsoft-com:office:office" xmlns:oel="http://schemas.microsoft.com/office/2019/extlst" xmlns:r="http://schemas.openxmlformats.org/officeDocument/2006/relationships" xmlns:m="http://schemas.openxmlformats.org/officeDocument/2006/math" xmlns:v="urn:schemas-microsoft-com:vml" xmlns:wp14="http://schemas.microsoft.com/office/word/2010/wordprocessingDrawing" xmlns:wp="http://schemas.openxmlformats.org/drawingml/2006/wordprocessingDrawing" xmlns:w10="urn:schemas-microsoft-com:office:word" xmlns:w="http://schemas.openxmlformats.org/wordprocessingml/2006/main" xmlns:w14="http://schemas.microsoft.com/office/word/2010/wordml" xmlns:w15="http://schemas.microsoft.com/office/word/2012/wordml" xmlns:w16cex="http://schemas.microsoft.com/office/word/2018/wordml/cex" xmlns:w16cid="http://schemas.microsoft.com/office/word/2016/wordml/cid" xmlns:w16="http://schemas.microsoft.com/office/word/2018/wordml" xmlns:w16sdtdh="http://schemas.microsoft.com/office/word/2020/wordml/sdtdatahash" xmlns:w16se="http://schemas.microsoft.com/office/word/2015/wordml/symex" xmlns:wpg="http://schemas.microsoft.com/office/word/2010/wordprocessingGroup" xmlns:wpi="http://schemas.microsoft.com/office/word/2010/wordprocessingInk" xmlns:wne="http://schemas.microsoft.com/office/word/2006/wordml" xmlns:wps="http://schemas.microsoft.com/office/word/2010/wordprocessingShape">
+  <w:p>
+    <w:pPr>
+      <w:pStyle w:val="Footer"/>
+      <w:pBdr>
+        <w:top w:val="single" w:sz="6" w:space="4" w:color="BFBFBF"/>
+      </w:pBdr>
+      <w:spacing w:after="120"/>
+      <w:jc w:val="center"/>
+    </w:pPr>
+    <w:r>
+      <w:rPr>
+        <w:sz w:val="18"/>
+      </w:rPr>
+      <w:t>Communication</w:t>
+    </w:r>
+    <w:r>
+      <w:rPr>
+        <w:sz w:val="18"/>
+      </w:rPr>
+      <w:t>_01</w:t>
+    </w:r>
+    <w:r>
+      <w:rPr>
+        <w:sz w:val="18"/>
+      </w:rPr>
+      <w:t xml:space="preserve"> — Direct Serial Communication * Communication * Page </w:t>
+    </w:r>
+    <w:r>
+      <w:fldChar w:fldCharType="begin"/>
+    </w:r>
+    <w:r>
+      <w:instrText xml:space="preserve"> PAGE </w:instrText>
+    </w:r>
+    <w:r>
+      <w:fldChar w:fldCharType="separate"/>
+    </w:r>
+    <w:r>
+      <w:t>1</w:t>
+    </w:r>
+    <w:r>
+      <w:fldChar w:fldCharType="end"/>
+    </w:r>
+  </w:p>
+</w:ftr>
+</file>
+
+<file path=word/footer3.xml><?xml version="1.0" encoding="utf-8"?>
 <w:ftr xmlns:wpc="http://schemas.microsoft.com/office/word/2010/wordprocessingCanvas" xmlns:cx="http://schemas.microsoft.com/office/drawing/2014/chartex" xmlns:cx1="http://schemas.microsoft.com/office/drawing/2015/9/8/chartex" xmlns:cx2="http://schemas.microsoft.com/office/drawing/2015/10/21/chartex" xmlns:cx3="http://schemas.microsoft.com/office/drawing/2016/5/9/chartex" xmlns:cx4="http://schemas.microsoft.com/office/drawing/2016/5/10/chartex" xmlns:cx5="http://schemas.microsoft.com/office/drawing/2016/5/11/chartex" xmlns:cx6="http://schemas.microsoft.com/office/drawing/2016/5/12/chartex" xmlns:cx7="http://schemas.microsoft.com/office/drawing/2016/5/13/chartex" xmlns:cx8="http://schemas.microsoft.com/office/drawing/2016/5/14/chartex" xmlns:mc="http://schemas.openxmlformats.org/markup-compatibility/2006" xmlns:aink="http://schemas.microsoft.com/office/drawing/2016/ink" xmlns:am3d="http://schemas.microsoft.com/office/drawing/2017/model3d" xmlns:o="urn:schemas-microsoft-com:office:office" xmlns:oel="http://schemas.microsoft.com/office/2019/extlst" xmlns:r="http://schemas.openxmlformats.org/officeDocument/2006/relationships" xmlns:m="http://schemas.openxmlformats.org/officeDocument/2006/math" xmlns:v="urn:schemas-microsoft-com:vml" xmlns:wp14="http://schemas.microsoft.com/office/word/2010/wordprocessingDrawing" xmlns:wp="http://schemas.openxmlformats.org/drawingml/2006/wordprocessingDrawing" xmlns:w10="urn:schemas-microsoft-com:office:word" xmlns:w="http://schemas.openxmlformats.org/wordprocessingml/2006/main" xmlns:w14="http://schemas.microsoft.com/office/word/2010/wordml" xmlns:w15="http://schemas.microsoft.com/office/word/2012/wordml" xmlns:w16cex="http://schemas.microsoft.com/office/word/2018/wordml/cex" xmlns:w16cid="http://schemas.microsoft.com/office/word/2016/wordml/cid" xmlns:w16="http://schemas.microsoft.com/office/word/2018/wordml" xmlns:w16sdtdh="http://schemas.microsoft.com/office/word/2020/wordml/sdtdatahash" xmlns:w16se="http://schemas.microsoft.com/office/word/2015/wordml/symex" xmlns:wpg="http://schemas.microsoft.com/office/word/2010/wordprocessingGroup" xmlns:wpi="http://schemas.microsoft.com/office/word/2010/wordprocessingInk" xmlns:wne="http://schemas.microsoft.com/office/word/2006/wordml" xmlns:wps="http://schemas.microsoft.com/office/word/2010/wordprocessingShape" mc:Ignorable="w14 w15 w16se w16cid w16 w16cex w16sdtdh wp14">
   <w:p>
     <w:pPr>
@@ -1779,9 +1728,9 @@
     </w:pPr>
     <w:r>
       <w:rPr>
-        <w:sz w:val="18"/>
-      </w:rPr>
-      <w:t>Last modified: September 12, 2026 6:36 PM EDT * Rodney Radford</w:t>
+        <w:sz val="18"/>
+      </w:rPr>
+      <w:t>Last modified: October 2, 2026 8:27 PM * Rodney Radford</w:t>
     </w:r>
   </w:p>
 </w:ftr>
@@ -1812,9 +1761,60 @@
 </w:footnotes>
 </file>
 
+<file path=word/header1.xml><?xml version="1.0" encoding="utf-8"?>
+<w:hdr xmlns:wpc="http://schemas.microsoft.com/office/word/2010/wordprocessingCanvas" xmlns:cx="http://schemas.microsoft.com/office/drawing/2014/chartex" xmlns:cx1="http://schemas.microsoft.com/office/drawing/2015/9/8/chartex" xmlns:cx2="http://schemas.microsoft.com/office/drawing/2015/10/21/chartex" xmlns:cx3="http://schemas.microsoft.com/office/drawing/2016/5/9/chartex" xmlns:cx4="http://schemas.microsoft.com/office/drawing/2016/5/10/chartex" xmlns:cx5="http://schemas.microsoft.com/office/drawing/2016/5/11/chartex" xmlns:cx6="http://schemas.microsoft.com/office/drawing/2016/5/12/chartex" xmlns:cx7="http://schemas.microsoft.com/office/drawing/2016/5/13/chartex" xmlns:cx8="http://schemas.microsoft.com/office/drawing/2016/5/14/chartex" xmlns:mc="http://schemas.openxmlformats.org/markup-compatibility/2006" xmlns:aink="http://schemas.microsoft.com/office/drawing/2016/ink" xmlns:am3d="http://schemas.microsoft.com/office/drawing/2017/model3d" xmlns:o="urn:schemas-microsoft-com:office:office" xmlns:oel="http://schemas.microsoft.com/office/2019/extlst" xmlns:r="http://schemas.openxmlformats.org/officeDocument/2006/relationships" xmlns:m="http://schemas.openxmlformats.org/officeDocument/2006/math" xmlns:v="urn:schemas-microsoft-com:vml" xmlns:wp14="http://schemas.microsoft.com/office/word/2010/wordprocessingDrawing" xmlns:wp="http://schemas.openxmlformats.org/drawingml/2006/wordprocessingDrawing" xmlns:w10="urn:schemas-microsoft-com:office:word" xmlns:w="http://schemas.openxmlformats.org/wordprocessingml/2006/main" xmlns:w14="http://schemas.microsoft.com/office/word/2010/wordml" xmlns:w15="http://schemas.microsoft.com/office/word/2012/wordml" xmlns:w16cex="http://schemas.microsoft.com/office/word/2018/wordml/cex" xmlns:w16cid="http://schemas.microsoft.com/office/word/2016/wordml/cid" xmlns:w16="http://schemas.microsoft.com/office/word/2018/wordml" xmlns:w16sdtdh="http://schemas.microsoft.com/office/word/2020/wordml/sdtdatahash" xmlns:w16se="http://schemas.microsoft.com/office/word/2015/wordml/symex" xmlns:wpg="http://schemas.microsoft.com/office/word/2010/wordprocessingGroup" xmlns:wpi="http://schemas.microsoft.com/office/word/2010/wordprocessingInk" xmlns:wne="http://schemas.microsoft.com/office/word/2006/wordml" xmlns:wps="http://schemas.microsoft.com/office/word/2010/wordprocessingShape" mc:Ignorable="w14 w15 w16se w16cid w16 w16cex w16sdtdh wp14">
+  <w:p>
+    <w:pPr>
+      <w:pStyle w:val="Header"/>
+    </w:pPr>
+  </w:p>
+</w:hdr>
+</file>
+
+<file path=word/header2.xml><?xml version="1.0" encoding="utf-8"?>
+<w:hdr xmlns:wpc="http://schemas.microsoft.com/office/word/2010/wordprocessingCanvas" xmlns:cx="http://schemas.microsoft.com/office/drawing/2014/chartex" xmlns:cx1="http://schemas.microsoft.com/office/drawing/2015/9/8/chartex" xmlns:cx2="http://schemas.microsoft.com/office/drawing/2015/10/21/chartex" xmlns:cx3="http://schemas.microsoft.com/office/drawing/2016/5/9/chartex" xmlns:cx4="http://schemas.microsoft.com/office/drawing/2016/5/10/chartex" xmlns:cx5="http://schemas.microsoft.com/office/drawing/2016/5/11/chartex" xmlns:cx6="http://schemas.microsoft.com/office/drawing/2016/5/12/chartex" xmlns:cx7="http://schemas.microsoft.com/office/drawing/2016/5/13/chartex" xmlns:cx8="http://schemas.microsoft.com/office/drawing/2016/5/14/chartex" xmlns:mc="http://schemas.openxmlformats.org/markup-compatibility/2006" xmlns:aink="http://schemas.microsoft.com/office/drawing/2016/ink" xmlns:am3d="http://schemas.microsoft.com/office/drawing/2017/model3d" xmlns:o="urn:schemas-microsoft-com:office:office" xmlns:oel="http://schemas.microsoft.com/office/2019/extlst" xmlns:r="http://schemas.openxmlformats.org/officeDocument/2006/relationships" xmlns:m="http://schemas.openxmlformats.org/officeDocument/2006/math" xmlns:v="urn:schemas-microsoft-com:vml" xmlns:wp14="http://schemas.microsoft.com/office/word/2010/wordprocessingDrawing" xmlns:wp="http://schemas.openxmlformats.org/drawingml/2006/wordprocessingDrawing" xmlns:w10="urn:schemas-microsoft-com:office:word" xmlns:w="http://schemas.openxmlformats.org/wordprocessingml/2006/main" xmlns:w14="http://schemas.microsoft.com/office/word/2010/wordml" xmlns:w15="http://schemas.microsoft.com/office/word/2012/wordml" xmlns:w16cex="http://schemas.microsoft.com/office/word/2018/wordml/cex" xmlns:w16cid="http://schemas.microsoft.com/office/word/2016/wordml/cid" xmlns:w16="http://schemas.microsoft.com/office/word/2018/wordml" xmlns:w16sdtdh="http://schemas.microsoft.com/office/word/2020/wordml/sdtdatahash" xmlns:w16se="http://schemas.microsoft.com/office/word/2015/wordml/symex" xmlns:wpg="http://schemas.microsoft.com/office/word/2010/wordprocessingGroup" xmlns:wpi="http://schemas.microsoft.com/office/word/2010/wordprocessingInk" xmlns:wne="http://schemas.microsoft.com/office/word/2006/wordml" xmlns:wps="http://schemas.microsoft.com/office/word/2010/wordprocessingShape" mc:Ignorable="w14 w15 w16se w16cid w16 w16cex w16sdtdh wp14">
+  <w:p>
+    <w:pPr>
+      <w:pStyle w:val="Header"/>
+    </w:pPr>
+  </w:p>
+</w:hdr>
+</file>
+
+<file path=word/header3.xml><?xml version="1.0" encoding="utf-8"?>
+<w:hdr xmlns:wpc="http://schemas.microsoft.com/office/word/2010/wordprocessingCanvas" xmlns:cx="http://schemas.microsoft.com/office/drawing/2014/chartex" xmlns:cx1="http://schemas.microsoft.com/office/drawing/2015/9/8/chartex" xmlns:cx2="http://schemas.microsoft.com/office/drawing/2015/10/21/chartex" xmlns:cx3="http://schemas.microsoft.com/office/drawing/2016/5/9/chartex" xmlns:cx4="http://schemas.microsoft.com/office/drawing/2016/5/10/chartex" xmlns:cx5="http://schemas.microsoft.com/office/drawing/2016/5/11/chartex" xmlns:cx6="http://schemas.microsoft.com/office/drawing/2016/5/12/chartex" xmlns:cx7="http://schemas.microsoft.com/office/drawing/2016/5/13/chartex" xmlns:cx8="http://schemas.microsoft.com/office/drawing/2016/5/14/chartex" xmlns:mc="http://schemas.openxmlformats.org/markup-compatibility/2006" xmlns:aink="http://schemas.microsoft.com/office/drawing/2016/ink" xmlns:am3d="http://schemas.microsoft.com/office/drawing/2017/model3d" xmlns:o="urn:schemas-microsoft-com:office:office" xmlns:oel="http://schemas.microsoft.com/office/2019/extlst" xmlns:r="http://schemas.openxmlformats.org/officeDocument/2006/relationships" xmlns:m="http://schemas.openxmlformats.org/officeDocument/2006/math" xmlns:v="urn:schemas-microsoft-com:vml" xmlns:wp14="http://schemas.microsoft.com/office/word/2010/wordprocessingDrawing" xmlns:wp="http://schemas.openxmlformats.org/drawingml/2006/wordprocessingDrawing" xmlns:w10="urn:schemas-microsoft-com:office:word" xmlns:w="http://schemas.openxmlformats.org/wordprocessingml/2006/main" xmlns:w14="http://schemas.microsoft.com/office/word/2010/wordml" xmlns:w15="http://schemas.microsoft.com/office/word/2012/wordml" xmlns:w16cex="http://schemas.microsoft.com/office/word/2018/wordml/cex" xmlns:w16cid="http://schemas.microsoft.com/office/word/2016/wordml/cid" xmlns:w16="http://schemas.microsoft.com/office/word/2018/wordml" xmlns:w16sdtdh="http://schemas.microsoft.com/office/word/2020/wordml/sdtdatahash" xmlns:w16se="http://schemas.microsoft.com/office/word/2015/wordml/symex" xmlns:wpg="http://schemas.microsoft.com/office/word/2010/wordprocessingGroup" xmlns:wpi="http://schemas.microsoft.com/office/word/2010/wordprocessingInk" xmlns:wne="http://schemas.microsoft.com/office/word/2006/wordml" xmlns:wps="http://schemas.microsoft.com/office/word/2010/wordprocessingShape" mc:Ignorable="w14 w15 w16se w16cid w16 w16cex w16sdtdh wp14">
+  <w:p>
+    <w:pPr>
+      <w:pStyle w:val="Header"/>
+    </w:pPr>
+  </w:p>
+</w:hdr>
+</file>
+
 <file path=word/numbering.xml><?xml version="1.0" encoding="utf-8"?>
 <w:numbering xmlns:wpc="http://schemas.microsoft.com/office/word/2010/wordprocessingCanvas" xmlns:cx="http://schemas.microsoft.com/office/drawing/2014/chartex" xmlns:cx1="http://schemas.microsoft.com/office/drawing/2015/9/8/chartex" xmlns:cx2="http://schemas.microsoft.com/office/drawing/2015/10/21/chartex" xmlns:cx3="http://schemas.microsoft.com/office/drawing/2016/5/9/chartex" xmlns:cx4="http://schemas.microsoft.com/office/drawing/2016/5/10/chartex" xmlns:cx5="http://schemas.microsoft.com/office/drawing/2016/5/11/chartex" xmlns:cx6="http://schemas.microsoft.com/office/drawing/2016/5/12/chartex" xmlns:cx7="http://schemas.microsoft.com/office/drawing/2016/5/13/chartex" xmlns:cx8="http://schemas.microsoft.com/office/drawing/2016/5/14/chartex" xmlns:mc="http://schemas.openxmlformats.org/markup-compatibility/2006" xmlns:aink="http://schemas.microsoft.com/office/drawing/2016/ink" xmlns:am3d="http://schemas.microsoft.com/office/drawing/2017/model3d" xmlns:o="urn:schemas-microsoft-com:office:office" xmlns:oel="http://schemas.microsoft.com/office/2019/extlst" xmlns:r="http://schemas.openxmlformats.org/officeDocument/2006/relationships" xmlns:m="http://schemas.openxmlformats.org/officeDocument/2006/math" xmlns:v="urn:schemas-microsoft-com:vml" xmlns:wp14="http://schemas.microsoft.com/office/word/2010/wordprocessingDrawing" xmlns:wp="http://schemas.openxmlformats.org/drawingml/2006/wordprocessingDrawing" xmlns:w10="urn:schemas-microsoft-com:office:word" xmlns:w="http://schemas.openxmlformats.org/wordprocessingml/2006/main" xmlns:w14="http://schemas.microsoft.com/office/word/2010/wordml" xmlns:w15="http://schemas.microsoft.com/office/word/2012/wordml" xmlns:w16cex="http://schemas.microsoft.com/office/word/2018/wordml/cex" xmlns:w16cid="http://schemas.microsoft.com/office/word/2016/wordml/cid" xmlns:w16="http://schemas.microsoft.com/office/word/2018/wordml" xmlns:w16sdtdh="http://schemas.microsoft.com/office/word/2020/wordml/sdtdatahash" xmlns:w16se="http://schemas.microsoft.com/office/word/2015/wordml/symex" xmlns:wpg="http://schemas.microsoft.com/office/word/2010/wordprocessingGroup" xmlns:wpi="http://schemas.microsoft.com/office/word/2010/wordprocessingInk" xmlns:wne="http://schemas.microsoft.com/office/word/2006/wordml" xmlns:wps="http://schemas.microsoft.com/office/word/2010/wordprocessingShape" mc:Ignorable="w14 w15 w16se w16cid w16 w16cex w16sdtdh wp14">
   <w:abstractNum w:abstractNumId="0" w15:restartNumberingAfterBreak="0">
+    <w:nsid w:val="FFFFFF89"/>
+    <w:multiLevelType w:val="singleLevel"/>
+    <w:tmpl w:val="74A4244C"/>
+    <w:lvl w:ilvl="0">
+      <w:start w:val="1"/>
+      <w:numFmt w:val="bullet"/>
+      <w:pStyle w:val="ListBullet"/>
+      <w:lvlText w:val=""/>
+      <w:lvlJc w:val="left"/>
+      <w:pPr>
+        <w:tabs>
+          <w:tab w:val="num" w:pos="360"/>
+        </w:tabs>
+        <w:ind w:left="360" w:hanging="360"/>
+      </w:pPr>
+      <w:rPr>
+        <w:rFonts w:ascii="Symbol" w:hAnsi="Symbol" w:hint="default"/>
+      </w:rPr>
+    </w:lvl>
+  </w:abstractNum>
+  <w:abstractNum w:abstractNumId="1" w15:restartNumberingAfterBreak="0">
     <w:nsid w:val="3988645E"/>
     <w:multiLevelType w:val="multilevel"/>
     <w:tmpl w:val="808608D0"/>
@@ -1936,7 +1936,7 @@
       </w:pPr>
     </w:lvl>
   </w:abstractNum>
-  <w:abstractNum w:abstractNumId="1" w15:restartNumberingAfterBreak="0">
+  <w:abstractNum w:abstractNumId="2" w15:restartNumberingAfterBreak="0">
     <w:nsid w:val="3F21080E"/>
     <w:multiLevelType w:val="multilevel"/>
     <w:tmpl w:val="484CEE72"/>
@@ -2068,7 +2068,7 @@
       </w:rPr>
     </w:lvl>
   </w:abstractNum>
-  <w:abstractNum w:abstractNumId="2" w15:restartNumberingAfterBreak="0">
+  <w:abstractNum w:abstractNumId="3" w15:restartNumberingAfterBreak="0">
     <w:nsid w:val="419A72B3"/>
     <w:multiLevelType w:val="multilevel"/>
     <w:tmpl w:val="0D5CD3B8"/>
@@ -2200,7 +2200,7 @@
       </w:rPr>
     </w:lvl>
   </w:abstractNum>
-  <w:abstractNum w:abstractNumId="3" w15:restartNumberingAfterBreak="0">
+  <w:abstractNum w:abstractNumId="4" w15:restartNumberingAfterBreak="0">
     <w:nsid w:val="4CDC552D"/>
     <w:multiLevelType w:val="multilevel"/>
     <w:tmpl w:val="BBE4BBA8"/>
@@ -2332,7 +2332,7 @@
       </w:rPr>
     </w:lvl>
   </w:abstractNum>
-  <w:abstractNum w:abstractNumId="4" w15:restartNumberingAfterBreak="0">
+  <w:abstractNum w:abstractNumId="5" w15:restartNumberingAfterBreak="0">
     <w:nsid w:val="50D13B50"/>
     <w:multiLevelType w:val="multilevel"/>
     <w:tmpl w:val="569CF578"/>
@@ -2464,7 +2464,7 @@
       </w:rPr>
     </w:lvl>
   </w:abstractNum>
-  <w:abstractNum w:abstractNumId="5" w15:restartNumberingAfterBreak="0">
+  <w:abstractNum w:abstractNumId="6" w15:restartNumberingAfterBreak="0">
     <w:nsid w:val="61F66A14"/>
     <w:multiLevelType w:val="multilevel"/>
     <w:tmpl w:val="7F9A9348"/>
@@ -2596,7 +2596,7 @@
       </w:rPr>
     </w:lvl>
   </w:abstractNum>
-  <w:abstractNum w:abstractNumId="6" w15:restartNumberingAfterBreak="0">
+  <w:abstractNum w:abstractNumId="7" w15:restartNumberingAfterBreak="0">
     <w:nsid w:val="742F0D33"/>
     <w:multiLevelType w:val="multilevel"/>
     <w:tmpl w:val="2724F2E8"/>
@@ -2711,24 +2711,27 @@
     </w:lvl>
   </w:abstractNum>
   <w:num w:numId="1" w16cid:durableId="1462260848">
+    <w:abstractNumId w:val="6"/>
+  </w:num>
+  <w:num w:numId="2" w16cid:durableId="636879405">
+    <w:abstractNumId w:val="4"/>
+  </w:num>
+  <w:num w:numId="3" w16cid:durableId="708996177">
     <w:abstractNumId w:val="5"/>
   </w:num>
-  <w:num w:numId="2" w16cid:durableId="636879405">
+  <w:num w:numId="4" w16cid:durableId="11615721">
     <w:abstractNumId w:val="3"/>
   </w:num>
-  <w:num w:numId="3" w16cid:durableId="708996177">
-    <w:abstractNumId w:val="4"/>
+  <w:num w:numId="5" w16cid:durableId="1304234967">
+    <w:abstractNumId w:val="7"/>
   </w:num>
-  <w:num w:numId="4" w16cid:durableId="11615721">
+  <w:num w:numId="6" w16cid:durableId="612707474">
     <w:abstractNumId w:val="2"/>
   </w:num>
-  <w:num w:numId="5" w16cid:durableId="1304234967">
-    <w:abstractNumId w:val="6"/>
-  </w:num>
-  <w:num w:numId="6" w16cid:durableId="612707474">
+  <w:num w:numId="7" w16cid:durableId="1078406883">
     <w:abstractNumId w:val="1"/>
   </w:num>
-  <w:num w:numId="7" w16cid:durableId="1078406883">
+  <w:num w:numId="8" w16cid:durableId="403260358">
     <w:abstractNumId w:val="0"/>
   </w:num>
 </w:numbering>

</xml_diff>

<commit_message>
clean up issues with footers
</commit_message>
<xml_diff>
--- a/Communications/SoutheastCon_Communication_01_Direct_Serial.docx
+++ b/Communications/SoutheastCon_Communication_01_Direct_Serial.docx
@@ -398,11 +398,11 @@
         <w:spacing w:line="240" w:lineRule="auto"/>
       </w:pPr>
       <w:r>
-        <w:t xml:space="preserve">The important point is that 5v and 3.3v are not interchangeable logic levels. A 3.3v output can be acceptable to some 5v inputs, while a 5v output may not be safe for a 3.3v input. Always determine the electrical requirements of both </w:t>
+        <w:t xml:space="preserve">The important point is that 5v and 3.3v are not interchangeable logic levels. A 3.3v output can be acceptable to some 5v inputs, while a 5v output may not be safe for a 3.3v input. Always determine the electrical requirements of both sides before connecting a signal between systems that use different logic voltages. In this tutorial, the ESP32 GPIO </w:t>
       </w:r>
       <w:r>
         <w:lastRenderedPageBreak/>
-        <w:t>sides before connecting a signal between systems that use different logic voltages. In this tutorial, the ESP32 GPIO pins are designed for approximately 3.3v operation, so a voltage above the ESP32's specified input limit can damage its GPIO.</w:t>
+        <w:t>pins are designed for approximately 3.3v operation, so a voltage above the ESP32's specified input limit can damage its GPIO.</w:t>
       </w:r>
     </w:p>
     <w:p>
@@ -1581,7 +1581,7 @@
 </file>
 
 <file path=word/footer1.xml><?xml version="1.0" encoding="utf-8"?>
-<w:ftr xmlns:wpc="http://schemas.microsoft.com/office/word/2010/wordprocessingCanvas" xmlns:cx="http://schemas.microsoft.com/office/drawing/2014/chartex" xmlns:cx1="http://schemas.microsoft.com/office/drawing/2015/9/8/chartex" xmlns:cx2="http://schemas.microsoft.com/office/drawing/2015/10/21/chartex" xmlns:cx3="http://schemas.microsoft.com/office/drawing/2016/5/9/chartex" xmlns:cx4="http://schemas.microsoft.com/office/drawing/2016/5/10/chartex" xmlns:cx5="http://schemas.microsoft.com/office/drawing/2016/5/11/chartex" xmlns:cx6="http://schemas.microsoft.com/office/drawing/2016/5/12/chartex" xmlns:cx7="http://schemas.microsoft.com/office/drawing/2016/5/13/chartex" xmlns:cx8="http://schemas.microsoft.com/office/drawing/2016/5/14/chartex" xmlns:mc="http://schemas.openxmlformats.org/markup-compatibility/2006" xmlns:aink="http://schemas.microsoft.com/office/drawing/2016/ink" xmlns:am3d="http://schemas.microsoft.com/office/drawing/2017/model3d" xmlns:o="urn:schemas-microsoft-com:office:office" xmlns:oel="http://schemas.microsoft.com/office/2019/extlst" xmlns:r="http://schemas.openxmlformats.org/officeDocument/2006/relationships" xmlns:m="http://schemas.openxmlformats.org/officeDocument/2006/math" xmlns:v="urn:schemas-microsoft-com:vml" xmlns:wp14="http://schemas.microsoft.com/office/word/2010/wordprocessingDrawing" xmlns:wp="http://schemas.openxmlformats.org/drawingml/2006/wordprocessingDrawing" xmlns:w10="urn:schemas-microsoft-com:office:word" xmlns:w="http://schemas.openxmlformats.org/wordprocessingml/2006/main" xmlns:w14="http://schemas.microsoft.com/office/word/2010/wordml" xmlns:w15="http://schemas.microsoft.com/office/word/2012/wordml" xmlns:w16cex="http://schemas.microsoft.com/office/word/2018/wordml/cex" xmlns:w16cid="http://schemas.microsoft.com/office/word/2016/wordml/cid" xmlns:w16="http://schemas.microsoft.com/office/word/2018/wordml" xmlns:w16sdtdh="http://schemas.microsoft.com/office/word/2020/wordml/sdtdatahash" xmlns:w16se="http://schemas.microsoft.com/office/word/2015/wordml/symex" xmlns:wpg="http://schemas.microsoft.com/office/word/2010/wordprocessingGroup" xmlns:wpi="http://schemas.microsoft.com/office/word/2010/wordprocessingInk" xmlns:wne="http://schemas.microsoft.com/office/word/2006/wordml" xmlns:wps="http://schemas.microsoft.com/office/word/2010/wordprocessingShape">
+<w:ftr xmlns:wpc="http://schemas.microsoft.com/office/word/2010/wordprocessingCanvas" xmlns:cx="http://schemas.microsoft.com/office/drawing/2014/chartex" xmlns:cx1="http://schemas.microsoft.com/office/drawing/2015/9/8/chartex" xmlns:cx2="http://schemas.microsoft.com/office/drawing/2015/10/21/chartex" xmlns:cx3="http://schemas.microsoft.com/office/drawing/2016/5/9/chartex" xmlns:cx4="http://schemas.microsoft.com/office/drawing/2016/5/10/chartex" xmlns:cx5="http://schemas.microsoft.com/office/drawing/2016/5/11/chartex" xmlns:cx6="http://schemas.microsoft.com/office/drawing/2016/5/12/chartex" xmlns:cx7="http://schemas.microsoft.com/office/drawing/2016/5/13/chartex" xmlns:cx8="http://schemas.microsoft.com/office/drawing/2016/5/14/chartex" xmlns:mc="http://schemas.openxmlformats.org/markup-compatibility/2006" xmlns:aink="http://schemas.microsoft.com/office/drawing/2016/ink" xmlns:am3d="http://schemas.microsoft.com/office/drawing/2017/model3d" xmlns:o="urn:schemas-microsoft-com:office:office" xmlns:oel="http://schemas.microsoft.com/office/2019/extlst" xmlns:r="http://schemas.openxmlformats.org/officeDocument/2006/relationships" xmlns:m="http://schemas.openxmlformats.org/officeDocument/2006/math" xmlns:v="urn:schemas-microsoft-com:vml" xmlns:wp14="http://schemas.microsoft.com/office/word/2010/wordprocessingDrawing" xmlns:wp="http://schemas.openxmlformats.org/drawingml/2006/wordprocessingDrawing" xmlns:w10="urn:schemas-microsoft-com:office:word" xmlns:w="http://schemas.openxmlformats.org/wordprocessingml/2006/main" xmlns:w14="http://schemas.microsoft.com/office/word/2010/wordml" xmlns:w15="http://schemas.microsoft.com/office/word/2012/wordml" xmlns:w16cex="http://schemas.microsoft.com/office/word/2018/wordml/cex" xmlns:w16cid="http://schemas.microsoft.com/office/word/2016/wordml/cid" xmlns:w16="http://schemas.microsoft.com/office/word/2018/wordml" xmlns:w16sdtdh="http://schemas.microsoft.com/office/word/2020/wordml/sdtdatahash" xmlns:w16se="http://schemas.microsoft.com/office/word/2015/wordml/symex" xmlns:wpg="http://schemas.microsoft.com/office/word/2010/wordprocessingGroup" xmlns:wpi="http://schemas.microsoft.com/office/word/2010/wordprocessingInk" xmlns:wne="http://schemas.microsoft.com/office/word/2006/wordml" xmlns:wps="http://schemas.microsoft.com/office/word/2010/wordprocessingShape" mc:Ignorable="w14 w15 w16se w16cid w16 w16cex w16sdtdh wp14">
   <w:p>
     <w:pPr>
       <w:pStyle w:val="Footer"/>
@@ -1629,7 +1629,7 @@
 </file>
 
 <file path=word/footer2.xml><?xml version="1.0" encoding="utf-8"?>
-<w:ftr xmlns:wpc="http://schemas.microsoft.com/office/word/2010/wordprocessingCanvas" xmlns:cx="http://schemas.microsoft.com/office/drawing/2014/chartex" xmlns:cx1="http://schemas.microsoft.com/office/drawing/2015/9/8/chartex" xmlns:cx2="http://schemas.microsoft.com/office/drawing/2015/10/21/chartex" xmlns:cx3="http://schemas.microsoft.com/office/drawing/2016/5/9/chartex" xmlns:cx4="http://schemas.microsoft.com/office/drawing/2016/5/10/chartex" xmlns:cx5="http://schemas.microsoft.com/office/drawing/2016/5/11/chartex" xmlns:cx6="http://schemas.microsoft.com/office/drawing/2016/5/12/chartex" xmlns:cx7="http://schemas.microsoft.com/office/drawing/2016/5/13/chartex" xmlns:cx8="http://schemas.microsoft.com/office/drawing/2016/5/14/chartex" xmlns:mc="http://schemas.openxmlformats.org/markup-compatibility/2006" xmlns:aink="http://schemas.microsoft.com/office/drawing/2016/ink" xmlns:am3d="http://schemas.microsoft.com/office/drawing/2017/model3d" xmlns:o="urn:schemas-microsoft-com:office:office" xmlns:oel="http://schemas.microsoft.com/office/2019/extlst" xmlns:r="http://schemas.openxmlformats.org/officeDocument/2006/relationships" xmlns:m="http://schemas.openxmlformats.org/officeDocument/2006/math" xmlns:v="urn:schemas-microsoft-com:vml" xmlns:wp14="http://schemas.microsoft.com/office/word/2010/wordprocessingDrawing" xmlns:wp="http://schemas.openxmlformats.org/drawingml/2006/wordprocessingDrawing" xmlns:w10="urn:schemas-microsoft-com:office:word" xmlns:w="http://schemas.openxmlformats.org/wordprocessingml/2006/main" xmlns:w14="http://schemas.microsoft.com/office/word/2010/wordml" xmlns:w15="http://schemas.microsoft.com/office/word/2012/wordml" xmlns:w16cex="http://schemas.microsoft.com/office/word/2018/wordml/cex" xmlns:w16cid="http://schemas.microsoft.com/office/word/2016/wordml/cid" xmlns:w16="http://schemas.microsoft.com/office/word/2018/wordml" xmlns:w16sdtdh="http://schemas.microsoft.com/office/word/2020/wordml/sdtdatahash" xmlns:w16se="http://schemas.microsoft.com/office/word/2015/wordml/symex" xmlns:wpg="http://schemas.microsoft.com/office/word/2010/wordprocessingGroup" xmlns:wpi="http://schemas.microsoft.com/office/word/2010/wordprocessingInk" xmlns:wne="http://schemas.microsoft.com/office/word/2006/wordml" xmlns:wps="http://schemas.microsoft.com/office/word/2010/wordprocessingShape">
+<w:ftr xmlns:wpc="http://schemas.microsoft.com/office/word/2010/wordprocessingCanvas" xmlns:cx="http://schemas.microsoft.com/office/drawing/2014/chartex" xmlns:cx1="http://schemas.microsoft.com/office/drawing/2015/9/8/chartex" xmlns:cx2="http://schemas.microsoft.com/office/drawing/2015/10/21/chartex" xmlns:cx3="http://schemas.microsoft.com/office/drawing/2016/5/9/chartex" xmlns:cx4="http://schemas.microsoft.com/office/drawing/2016/5/10/chartex" xmlns:cx5="http://schemas.microsoft.com/office/drawing/2016/5/11/chartex" xmlns:cx6="http://schemas.microsoft.com/office/drawing/2016/5/12/chartex" xmlns:cx7="http://schemas.microsoft.com/office/drawing/2016/5/13/chartex" xmlns:cx8="http://schemas.microsoft.com/office/drawing/2016/5/14/chartex" xmlns:mc="http://schemas.openxmlformats.org/markup-compatibility/2006" xmlns:aink="http://schemas.microsoft.com/office/drawing/2016/ink" xmlns:am3d="http://schemas.microsoft.com/office/drawing/2017/model3d" xmlns:o="urn:schemas-microsoft-com:office:office" xmlns:oel="http://schemas.microsoft.com/office/2019/extlst" xmlns:r="http://schemas.openxmlformats.org/officeDocument/2006/relationships" xmlns:m="http://schemas.openxmlformats.org/officeDocument/2006/math" xmlns:v="urn:schemas-microsoft-com:vml" xmlns:wp14="http://schemas.microsoft.com/office/word/2010/wordprocessingDrawing" xmlns:wp="http://schemas.openxmlformats.org/drawingml/2006/wordprocessingDrawing" xmlns:w10="urn:schemas-microsoft-com:office:word" xmlns:w="http://schemas.openxmlformats.org/wordprocessingml/2006/main" xmlns:w14="http://schemas.microsoft.com/office/word/2010/wordml" xmlns:w15="http://schemas.microsoft.com/office/word/2012/wordml" xmlns:w16cex="http://schemas.microsoft.com/office/word/2018/wordml/cex" xmlns:w16cid="http://schemas.microsoft.com/office/word/2016/wordml/cid" xmlns:w16="http://schemas.microsoft.com/office/word/2018/wordml" xmlns:w16sdtdh="http://schemas.microsoft.com/office/word/2020/wordml/sdtdatahash" xmlns:w16se="http://schemas.microsoft.com/office/word/2015/wordml/symex" xmlns:wpg="http://schemas.microsoft.com/office/word/2010/wordprocessingGroup" xmlns:wpi="http://schemas.microsoft.com/office/word/2010/wordprocessingInk" xmlns:wne="http://schemas.microsoft.com/office/word/2006/wordml" xmlns:wps="http://schemas.microsoft.com/office/word/2010/wordprocessingShape" mc:Ignorable="w14 w15 w16se w16cid w16 w16cex w16sdtdh wp14">
   <w:p>
     <w:pPr>
       <w:pStyle w:val="Footer"/>
@@ -1682,9 +1682,8 @@
     <w:pPr>
       <w:pStyle w:val="Footer"/>
       <w:pBdr>
-        <w:top w:val="single" w:sz="6" w:space="4" w:color="BFBFBF"/>
+        <w:top w:val="single" w:sz="6" w:space="1" w:color="BFBFBF"/>
       </w:pBdr>
-      <w:spacing w:after="120"/>
       <w:jc w:val="center"/>
     </w:pPr>
     <w:r>
@@ -1727,9 +1726,6 @@
       <w:jc w:val="center"/>
     </w:pPr>
     <w:r>
-      <w:rPr>
-        <w:sz val="18"/>
-      </w:rPr>
       <w:t>Last modified: October 2, 2026 8:27 PM * Rodney Radford</w:t>
     </w:r>
   </w:p>
@@ -1800,7 +1796,6 @@
     <w:lvl w:ilvl="0">
       <w:start w:val="1"/>
       <w:numFmt w:val="bullet"/>
-      <w:pStyle w:val="ListBullet"/>
       <w:lvlText w:val=""/>
       <w:lvlJc w:val="left"/>
       <w:pPr>

</xml_diff>